<commit_message>
vault backup: 2026-07-06 18:16:35
</commit_message>
<xml_diff>
--- a/求职/CV/hpc/CV_hpc.docx
+++ b/求职/CV/hpc/CV_hpc.docx
@@ -104,20 +104,25 @@
     </w:p>
     <w:p>
       <w:pPr>
-        <w:rPr>
-          <w:rFonts w:ascii="Tahoma" w:hAnsi="Tahoma" w:cs="Tahoma"/>
-          <w:szCs w:val="21"/>
-        </w:rPr>
-      </w:pPr>
-      <w:r>
-        <w:rPr>
-          <w:rFonts w:ascii="Tahoma" w:hAnsi="Tahoma" w:cs="Tahoma"/>
-          <w:szCs w:val="21"/>
-        </w:rPr>
-        <w:pict w14:anchorId="3F14B289">
-          <v:rect id="_x0000_i1025" style="width:0;height:1.5pt" o:hralign="center" o:hrstd="t" o:hr="t" fillcolor="#a0a0a0" stroked="f"/>
-        </w:pict>
-      </w:r>
+        <w:pStyle w:val="CVSection"/>
+        <w:pBdr>
+          <w:bottom w:val="single" w:sz="4" w:space="1" w:color="808080"/>
+        </w:pBdr>
+        <w:spacing w:before="80"/>
+        <w:rPr>
+          <w:rFonts w:ascii="Tahoma" w:hAnsi="Tahoma" w:cs="Tahoma"/>
+          <w:sz w:val="22"/>
+        </w:rPr>
+      </w:pPr>
+      <w:proofErr w:type="spellStart"/>
+      <w:r>
+        <w:rPr>
+          <w:rFonts w:ascii="宋体" w:eastAsia="宋体" w:hAnsi="宋体" w:cs="宋体" w:hint="eastAsia"/>
+          <w:sz w:val="22"/>
+        </w:rPr>
+        <w:t>教育背景</w:t>
+      </w:r>
+      <w:proofErr w:type="spellEnd"/>
     </w:p>
     <w:p>
       <w:pPr>
@@ -292,28 +297,1080 @@
           <w:szCs w:val="21"/>
         </w:rPr>
         <w:t>项目，一等荣誉学位</w:t>
-      </w:r>
-    </w:p>
-    <w:p>
-      <w:pPr>
-        <w:rPr>
-          <w:rFonts w:ascii="Tahoma" w:hAnsi="Tahoma" w:cs="Tahoma"/>
-          <w:szCs w:val="21"/>
-        </w:rPr>
-      </w:pPr>
-      <w:r>
-        <w:rPr>
-          <w:rFonts w:ascii="Tahoma" w:hAnsi="Tahoma" w:cs="Tahoma"/>
-          <w:szCs w:val="21"/>
-        </w:rPr>
-        <w:pict w14:anchorId="1811F761">
-          <v:rect id="_x0000_i1026" style="width:0;height:1.5pt" o:hralign="center" o:hrstd="t" o:hr="t" fillcolor="#a0a0a0" stroked="f"/>
-        </w:pict>
       </w:r>
     </w:p>
     <w:bookmarkEnd w:id="0"/>
     <w:p>
       <w:pPr>
+        <w:pStyle w:val="CVSection"/>
+        <w:pBdr>
+          <w:bottom w:val="single" w:sz="4" w:space="1" w:color="808080"/>
+        </w:pBdr>
+        <w:spacing w:before="80"/>
+        <w:rPr>
+          <w:rFonts w:ascii="Tahoma" w:hAnsi="Tahoma" w:cs="Tahoma"/>
+          <w:sz w:val="22"/>
+          <w:lang w:eastAsia="zh-CN"/>
+        </w:rPr>
+      </w:pPr>
+      <w:r>
+        <w:rPr>
+          <w:rFonts w:ascii="宋体" w:eastAsia="宋体" w:hAnsi="宋体" w:cs="宋体" w:hint="eastAsia"/>
+          <w:sz w:val="22"/>
+          <w:lang w:eastAsia="zh-CN"/>
+        </w:rPr>
+        <w:t>技术能力</w:t>
+      </w:r>
+    </w:p>
+    <w:p>
+      <w:pPr>
+        <w:rPr>
+          <w:rFonts w:ascii="Tahoma" w:hAnsi="Tahoma" w:cs="Tahoma"/>
+          <w:szCs w:val="21"/>
+        </w:rPr>
+      </w:pPr>
+      <w:r>
+        <w:rPr>
+          <w:rFonts w:ascii="Tahoma" w:hAnsi="Tahoma" w:cs="Tahoma"/>
+          <w:b/>
+          <w:bCs/>
+          <w:szCs w:val="21"/>
+        </w:rPr>
+        <w:t>编程语言</w:t>
+      </w:r>
+      <w:r>
+        <w:rPr>
+          <w:rFonts w:ascii="Tahoma" w:hAnsi="Tahoma" w:cs="Tahoma" w:hint="eastAsia"/>
+          <w:szCs w:val="21"/>
+        </w:rPr>
+        <w:t>:</w:t>
+      </w:r>
+      <w:r>
+        <w:rPr>
+          <w:rFonts w:ascii="Tahoma" w:hAnsi="Tahoma" w:cs="Tahoma"/>
+          <w:szCs w:val="21"/>
+        </w:rPr>
+        <w:t>C/C++</w:t>
+      </w:r>
+      <w:r>
+        <w:rPr>
+          <w:rFonts w:ascii="Tahoma" w:hAnsi="Tahoma" w:cs="Tahoma"/>
+          <w:szCs w:val="21"/>
+        </w:rPr>
+        <w:t>、</w:t>
+      </w:r>
+      <w:r>
+        <w:rPr>
+          <w:rFonts w:ascii="Tahoma" w:hAnsi="Tahoma" w:cs="Tahoma"/>
+          <w:szCs w:val="21"/>
+        </w:rPr>
+        <w:t>Python</w:t>
+      </w:r>
+      <w:r>
+        <w:rPr>
+          <w:rFonts w:ascii="Tahoma" w:hAnsi="Tahoma" w:cs="Tahoma"/>
+          <w:szCs w:val="21"/>
+        </w:rPr>
+        <w:t>，具备数值计算程序、并行程序、性能测试代码和自动化分析脚本开发经验；掌握</w:t>
+      </w:r>
+      <w:r>
+        <w:rPr>
+          <w:rFonts w:ascii="Tahoma" w:hAnsi="Tahoma" w:cs="Tahoma"/>
+          <w:szCs w:val="21"/>
+        </w:rPr>
+        <w:t xml:space="preserve"> SQL </w:t>
+      </w:r>
+      <w:r>
+        <w:rPr>
+          <w:rFonts w:ascii="Tahoma" w:hAnsi="Tahoma" w:cs="Tahoma"/>
+          <w:szCs w:val="21"/>
+        </w:rPr>
+        <w:t>基础，能够完成实验数据建模、查询与分析；了解</w:t>
+      </w:r>
+      <w:r>
+        <w:rPr>
+          <w:rFonts w:ascii="Tahoma" w:hAnsi="Tahoma" w:cs="Tahoma"/>
+          <w:szCs w:val="21"/>
+        </w:rPr>
+        <w:t xml:space="preserve"> JavaScript</w:t>
+      </w:r>
+      <w:r>
+        <w:rPr>
+          <w:rFonts w:ascii="Tahoma" w:hAnsi="Tahoma" w:cs="Tahoma"/>
+          <w:szCs w:val="21"/>
+        </w:rPr>
+        <w:t>、</w:t>
+      </w:r>
+      <w:r>
+        <w:rPr>
+          <w:rFonts w:ascii="Tahoma" w:hAnsi="Tahoma" w:cs="Tahoma"/>
+          <w:szCs w:val="21"/>
+        </w:rPr>
+        <w:t>HTML</w:t>
+      </w:r>
+      <w:r>
+        <w:rPr>
+          <w:rFonts w:ascii="Tahoma" w:hAnsi="Tahoma" w:cs="Tahoma"/>
+          <w:szCs w:val="21"/>
+        </w:rPr>
+        <w:t>、</w:t>
+      </w:r>
+      <w:r>
+        <w:rPr>
+          <w:rFonts w:ascii="Tahoma" w:hAnsi="Tahoma" w:cs="Tahoma"/>
+          <w:szCs w:val="21"/>
+        </w:rPr>
+        <w:t>CSS</w:t>
+      </w:r>
+      <w:r>
+        <w:rPr>
+          <w:rFonts w:ascii="Tahoma" w:hAnsi="Tahoma" w:cs="Tahoma"/>
+          <w:szCs w:val="21"/>
+        </w:rPr>
+        <w:t>，可配合完成基础</w:t>
+      </w:r>
+      <w:r>
+        <w:rPr>
+          <w:rFonts w:ascii="Tahoma" w:hAnsi="Tahoma" w:cs="Tahoma"/>
+          <w:szCs w:val="21"/>
+        </w:rPr>
+        <w:t xml:space="preserve"> Web </w:t>
+      </w:r>
+      <w:r>
+        <w:rPr>
+          <w:rFonts w:ascii="Tahoma" w:hAnsi="Tahoma" w:cs="Tahoma"/>
+          <w:szCs w:val="21"/>
+        </w:rPr>
+        <w:t>展示与系统原型开发。</w:t>
+      </w:r>
+    </w:p>
+    <w:p>
+      <w:pPr>
+        <w:rPr>
+          <w:rFonts w:ascii="Tahoma" w:hAnsi="Tahoma" w:cs="Tahoma"/>
+          <w:szCs w:val="21"/>
+        </w:rPr>
+      </w:pPr>
+      <w:r>
+        <w:rPr>
+          <w:rFonts w:ascii="Tahoma" w:hAnsi="Tahoma" w:cs="Tahoma"/>
+          <w:b/>
+          <w:bCs/>
+          <w:szCs w:val="21"/>
+        </w:rPr>
+        <w:t>高性能计算</w:t>
+      </w:r>
+      <w:r>
+        <w:rPr>
+          <w:rFonts w:ascii="Tahoma" w:hAnsi="Tahoma" w:cs="Tahoma" w:hint="eastAsia"/>
+          <w:szCs w:val="21"/>
+        </w:rPr>
+        <w:t>:</w:t>
+      </w:r>
+      <w:r>
+        <w:rPr>
+          <w:rFonts w:ascii="Tahoma" w:hAnsi="Tahoma" w:cs="Tahoma"/>
+          <w:szCs w:val="21"/>
+        </w:rPr>
+        <w:t>MPI</w:t>
+      </w:r>
+      <w:r>
+        <w:rPr>
+          <w:rFonts w:ascii="Tahoma" w:hAnsi="Tahoma" w:cs="Tahoma"/>
+          <w:szCs w:val="21"/>
+        </w:rPr>
+        <w:t>、</w:t>
+      </w:r>
+      <w:r>
+        <w:rPr>
+          <w:rFonts w:ascii="Tahoma" w:hAnsi="Tahoma" w:cs="Tahoma"/>
+          <w:szCs w:val="21"/>
+        </w:rPr>
+        <w:t>OpenMP</w:t>
+      </w:r>
+      <w:r>
+        <w:rPr>
+          <w:rFonts w:ascii="Tahoma" w:hAnsi="Tahoma" w:cs="Tahoma"/>
+          <w:szCs w:val="21"/>
+        </w:rPr>
+        <w:t>、</w:t>
+      </w:r>
+      <w:proofErr w:type="spellStart"/>
+      <w:r>
+        <w:rPr>
+          <w:rFonts w:ascii="Tahoma" w:hAnsi="Tahoma" w:cs="Tahoma"/>
+          <w:szCs w:val="21"/>
+        </w:rPr>
+        <w:t>PETSc</w:t>
+      </w:r>
+      <w:proofErr w:type="spellEnd"/>
+      <w:r>
+        <w:rPr>
+          <w:rFonts w:ascii="Tahoma" w:hAnsi="Tahoma" w:cs="Tahoma"/>
+          <w:szCs w:val="21"/>
+        </w:rPr>
+        <w:t>、</w:t>
+      </w:r>
+      <w:proofErr w:type="spellStart"/>
+      <w:r>
+        <w:rPr>
+          <w:rFonts w:ascii="Tahoma" w:hAnsi="Tahoma" w:cs="Tahoma"/>
+          <w:szCs w:val="21"/>
+        </w:rPr>
+        <w:t>Slurm</w:t>
+      </w:r>
+      <w:proofErr w:type="spellEnd"/>
+      <w:r>
+        <w:rPr>
+          <w:rFonts w:ascii="Tahoma" w:hAnsi="Tahoma" w:cs="Tahoma"/>
+          <w:szCs w:val="21"/>
+        </w:rPr>
+        <w:t>，具备在</w:t>
+      </w:r>
+      <w:r>
+        <w:rPr>
+          <w:rFonts w:ascii="Tahoma" w:hAnsi="Tahoma" w:cs="Tahoma"/>
+          <w:szCs w:val="21"/>
+        </w:rPr>
+        <w:t xml:space="preserve"> </w:t>
+      </w:r>
+      <w:r>
+        <w:rPr>
+          <w:rFonts w:ascii="Tahoma" w:hAnsi="Tahoma" w:cs="Tahoma"/>
+          <w:b/>
+          <w:bCs/>
+          <w:szCs w:val="21"/>
+        </w:rPr>
+        <w:t xml:space="preserve">ARCHER2 </w:t>
+      </w:r>
+      <w:proofErr w:type="gramStart"/>
+      <w:r>
+        <w:rPr>
+          <w:rFonts w:ascii="Tahoma" w:hAnsi="Tahoma" w:cs="Tahoma"/>
+          <w:b/>
+          <w:bCs/>
+          <w:szCs w:val="21"/>
+        </w:rPr>
+        <w:t>超算平台</w:t>
+      </w:r>
+      <w:proofErr w:type="gramEnd"/>
+      <w:r>
+        <w:rPr>
+          <w:rFonts w:ascii="Tahoma" w:hAnsi="Tahoma" w:cs="Tahoma"/>
+          <w:szCs w:val="21"/>
+        </w:rPr>
+        <w:t>上进行大规模并行实验、作业调度、日志分析和性能评估的经验；理解</w:t>
+      </w:r>
+      <w:r>
+        <w:rPr>
+          <w:rFonts w:ascii="Tahoma" w:hAnsi="Tahoma" w:cs="Tahoma"/>
+          <w:szCs w:val="21"/>
+        </w:rPr>
+        <w:t xml:space="preserve"> MPI </w:t>
+      </w:r>
+      <w:r>
+        <w:rPr>
+          <w:rFonts w:ascii="Tahoma" w:hAnsi="Tahoma" w:cs="Tahoma"/>
+          <w:szCs w:val="21"/>
+        </w:rPr>
+        <w:t>进程通信、</w:t>
+      </w:r>
+      <w:r>
+        <w:rPr>
+          <w:rFonts w:ascii="Tahoma" w:hAnsi="Tahoma" w:cs="Tahoma"/>
+          <w:szCs w:val="21"/>
+        </w:rPr>
+        <w:t xml:space="preserve">OpenMP </w:t>
+      </w:r>
+      <w:r>
+        <w:rPr>
+          <w:rFonts w:ascii="Tahoma" w:hAnsi="Tahoma" w:cs="Tahoma"/>
+          <w:szCs w:val="21"/>
+        </w:rPr>
+        <w:t>线程并行、</w:t>
+      </w:r>
+      <w:r>
+        <w:rPr>
+          <w:rFonts w:ascii="Tahoma" w:hAnsi="Tahoma" w:cs="Tahoma"/>
+          <w:szCs w:val="21"/>
+        </w:rPr>
+        <w:t xml:space="preserve">hybrid </w:t>
+      </w:r>
+      <w:proofErr w:type="spellStart"/>
+      <w:r>
+        <w:rPr>
+          <w:rFonts w:ascii="Tahoma" w:hAnsi="Tahoma" w:cs="Tahoma"/>
+          <w:szCs w:val="21"/>
+        </w:rPr>
+        <w:t>MPI+OpenMP</w:t>
+      </w:r>
+      <w:proofErr w:type="spellEnd"/>
+      <w:r>
+        <w:rPr>
+          <w:rFonts w:ascii="Tahoma" w:hAnsi="Tahoma" w:cs="Tahoma"/>
+          <w:szCs w:val="21"/>
+        </w:rPr>
+        <w:t>、</w:t>
+      </w:r>
+      <w:r>
+        <w:rPr>
+          <w:rFonts w:ascii="Tahoma" w:hAnsi="Tahoma" w:cs="Tahoma"/>
+          <w:szCs w:val="21"/>
+        </w:rPr>
+        <w:t>strong scaling</w:t>
+      </w:r>
+      <w:r>
+        <w:rPr>
+          <w:rFonts w:ascii="Tahoma" w:hAnsi="Tahoma" w:cs="Tahoma"/>
+          <w:szCs w:val="21"/>
+        </w:rPr>
+        <w:t>、</w:t>
+      </w:r>
+      <w:r>
+        <w:rPr>
+          <w:rFonts w:ascii="Tahoma" w:hAnsi="Tahoma" w:cs="Tahoma"/>
+          <w:szCs w:val="21"/>
+        </w:rPr>
+        <w:t>weak scaling</w:t>
+      </w:r>
+      <w:r>
+        <w:rPr>
+          <w:rFonts w:ascii="Tahoma" w:hAnsi="Tahoma" w:cs="Tahoma"/>
+          <w:szCs w:val="21"/>
+        </w:rPr>
+        <w:t>、</w:t>
+      </w:r>
+      <w:r>
+        <w:rPr>
+          <w:rFonts w:ascii="Tahoma" w:hAnsi="Tahoma" w:cs="Tahoma"/>
+          <w:szCs w:val="21"/>
+        </w:rPr>
+        <w:t>speedup</w:t>
+      </w:r>
+      <w:r>
+        <w:rPr>
+          <w:rFonts w:ascii="Tahoma" w:hAnsi="Tahoma" w:cs="Tahoma"/>
+          <w:szCs w:val="21"/>
+        </w:rPr>
+        <w:t>、</w:t>
+      </w:r>
+      <w:r>
+        <w:rPr>
+          <w:rFonts w:ascii="Tahoma" w:hAnsi="Tahoma" w:cs="Tahoma"/>
+          <w:szCs w:val="21"/>
+        </w:rPr>
+        <w:t xml:space="preserve">parallel efficiency </w:t>
+      </w:r>
+      <w:r>
+        <w:rPr>
+          <w:rFonts w:ascii="Tahoma" w:hAnsi="Tahoma" w:cs="Tahoma"/>
+          <w:szCs w:val="21"/>
+        </w:rPr>
+        <w:t>等概念。</w:t>
+      </w:r>
+    </w:p>
+    <w:p>
+      <w:pPr>
+        <w:rPr>
+          <w:rFonts w:ascii="宋体" w:eastAsia="宋体" w:hAnsi="宋体" w:cs="宋体"/>
+          <w:sz w:val="22"/>
+        </w:rPr>
+      </w:pPr>
+      <w:r>
+        <w:rPr>
+          <w:rFonts w:ascii="Tahoma" w:hAnsi="Tahoma" w:cs="Tahoma"/>
+          <w:b/>
+          <w:bCs/>
+          <w:szCs w:val="21"/>
+        </w:rPr>
+        <w:t>性能分析与系统基础</w:t>
+      </w:r>
+      <w:r>
+        <w:rPr>
+          <w:rFonts w:ascii="Tahoma" w:hAnsi="Tahoma" w:cs="Tahoma"/>
+          <w:szCs w:val="21"/>
+        </w:rPr>
+        <w:t>：</w:t>
+      </w:r>
+      <w:r>
+        <w:rPr>
+          <w:rFonts w:ascii="宋体" w:eastAsia="宋体" w:hAnsi="宋体" w:cs="宋体" w:hint="eastAsia"/>
+          <w:sz w:val="22"/>
+        </w:rPr>
+        <w:t>理解进程</w:t>
+      </w:r>
+      <w:r>
+        <w:rPr>
+          <w:rFonts w:ascii="Tahoma" w:hAnsi="Tahoma" w:cs="Tahoma"/>
+          <w:sz w:val="22"/>
+        </w:rPr>
+        <w:t>/</w:t>
+      </w:r>
+      <w:r>
+        <w:rPr>
+          <w:rFonts w:ascii="宋体" w:eastAsia="宋体" w:hAnsi="宋体" w:cs="宋体" w:hint="eastAsia"/>
+          <w:sz w:val="22"/>
+        </w:rPr>
+        <w:t>线程、同步开销、通信开销、</w:t>
+      </w:r>
+      <w:r>
+        <w:rPr>
+          <w:rFonts w:ascii="Tahoma" w:hAnsi="Tahoma" w:cs="Tahoma"/>
+          <w:sz w:val="22"/>
+        </w:rPr>
+        <w:t>I/O</w:t>
+      </w:r>
+      <w:r>
+        <w:rPr>
+          <w:rFonts w:ascii="宋体" w:eastAsia="宋体" w:hAnsi="宋体" w:cs="宋体" w:hint="eastAsia"/>
+          <w:sz w:val="22"/>
+        </w:rPr>
+        <w:t>、</w:t>
+      </w:r>
+      <w:r>
+        <w:rPr>
+          <w:rFonts w:ascii="Tahoma" w:hAnsi="Tahoma" w:cs="Tahoma"/>
+          <w:sz w:val="22"/>
+        </w:rPr>
+        <w:t>Cache locality</w:t>
+      </w:r>
+      <w:r>
+        <w:rPr>
+          <w:rFonts w:ascii="宋体" w:eastAsia="宋体" w:hAnsi="宋体" w:cs="宋体" w:hint="eastAsia"/>
+          <w:sz w:val="22"/>
+        </w:rPr>
+        <w:t>、</w:t>
+      </w:r>
+      <w:r>
+        <w:rPr>
+          <w:rFonts w:ascii="Tahoma" w:hAnsi="Tahoma" w:cs="Tahoma"/>
+          <w:sz w:val="22"/>
+        </w:rPr>
+        <w:t>NUMA</w:t>
+      </w:r>
+      <w:r>
+        <w:rPr>
+          <w:rFonts w:ascii="宋体" w:eastAsia="宋体" w:hAnsi="宋体" w:cs="宋体" w:hint="eastAsia"/>
+          <w:sz w:val="22"/>
+        </w:rPr>
+        <w:t>、</w:t>
+      </w:r>
+      <w:r>
+        <w:rPr>
+          <w:rFonts w:ascii="Tahoma" w:hAnsi="Tahoma" w:cs="Tahoma"/>
+          <w:sz w:val="22"/>
+        </w:rPr>
+        <w:t>memory bandwidth</w:t>
+      </w:r>
+      <w:r>
+        <w:rPr>
+          <w:rFonts w:ascii="宋体" w:eastAsia="宋体" w:hAnsi="宋体" w:cs="宋体" w:hint="eastAsia"/>
+          <w:sz w:val="22"/>
+        </w:rPr>
+        <w:t>、负载均衡，可从计算、通信、内存和线程调度角度解释性能瓶颈</w:t>
+      </w:r>
+    </w:p>
+    <w:p>
+      <w:pPr>
+        <w:rPr>
+          <w:rFonts w:ascii="Tahoma" w:hAnsi="Tahoma" w:cs="Tahoma"/>
+          <w:szCs w:val="21"/>
+        </w:rPr>
+      </w:pPr>
+      <w:r>
+        <w:rPr>
+          <w:rFonts w:ascii="Tahoma" w:hAnsi="Tahoma" w:cs="Tahoma"/>
+          <w:b/>
+          <w:bCs/>
+          <w:szCs w:val="21"/>
+        </w:rPr>
+        <w:t>数据处理与可视化：</w:t>
+      </w:r>
+      <w:r>
+        <w:rPr>
+          <w:rFonts w:ascii="Tahoma" w:hAnsi="Tahoma" w:cs="Tahoma"/>
+          <w:szCs w:val="21"/>
+        </w:rPr>
+        <w:t xml:space="preserve"> </w:t>
+      </w:r>
+      <w:r>
+        <w:rPr>
+          <w:rFonts w:ascii="Tahoma" w:hAnsi="Tahoma" w:cs="Tahoma"/>
+          <w:szCs w:val="21"/>
+        </w:rPr>
+        <w:t>熟悉</w:t>
+      </w:r>
+      <w:r>
+        <w:rPr>
+          <w:rFonts w:ascii="Tahoma" w:hAnsi="Tahoma" w:cs="Tahoma"/>
+          <w:szCs w:val="21"/>
+        </w:rPr>
+        <w:t xml:space="preserve"> Pandas</w:t>
+      </w:r>
+      <w:r>
+        <w:rPr>
+          <w:rFonts w:ascii="Tahoma" w:hAnsi="Tahoma" w:cs="Tahoma"/>
+          <w:szCs w:val="21"/>
+        </w:rPr>
+        <w:t>、</w:t>
+      </w:r>
+      <w:r>
+        <w:rPr>
+          <w:rFonts w:ascii="Tahoma" w:hAnsi="Tahoma" w:cs="Tahoma"/>
+          <w:szCs w:val="21"/>
+        </w:rPr>
+        <w:t>NumPy</w:t>
+      </w:r>
+      <w:r>
+        <w:rPr>
+          <w:rFonts w:ascii="Tahoma" w:hAnsi="Tahoma" w:cs="Tahoma"/>
+          <w:szCs w:val="21"/>
+        </w:rPr>
+        <w:t>、</w:t>
+      </w:r>
+      <w:r>
+        <w:rPr>
+          <w:rFonts w:ascii="Tahoma" w:hAnsi="Tahoma" w:cs="Tahoma"/>
+          <w:szCs w:val="21"/>
+        </w:rPr>
+        <w:t>Matplotlib</w:t>
+      </w:r>
+      <w:r>
+        <w:rPr>
+          <w:rFonts w:ascii="Tahoma" w:hAnsi="Tahoma" w:cs="Tahoma"/>
+          <w:szCs w:val="21"/>
+        </w:rPr>
+        <w:t>，可完成实验日志解析、</w:t>
+      </w:r>
+      <w:r>
+        <w:rPr>
+          <w:rFonts w:ascii="Tahoma" w:hAnsi="Tahoma" w:cs="Tahoma"/>
+          <w:szCs w:val="21"/>
+        </w:rPr>
+        <w:t xml:space="preserve">CSV </w:t>
+      </w:r>
+      <w:r>
+        <w:rPr>
+          <w:rFonts w:ascii="Tahoma" w:hAnsi="Tahoma" w:cs="Tahoma"/>
+          <w:szCs w:val="21"/>
+        </w:rPr>
+        <w:t>数据整理、</w:t>
+      </w:r>
+      <w:r>
+        <w:rPr>
+          <w:rFonts w:ascii="Tahoma" w:hAnsi="Tahoma" w:cs="Tahoma"/>
+          <w:szCs w:val="21"/>
+        </w:rPr>
+        <w:t xml:space="preserve">runtime / speedup / parallel efficiency </w:t>
+      </w:r>
+      <w:r>
+        <w:rPr>
+          <w:rFonts w:ascii="Tahoma" w:hAnsi="Tahoma" w:cs="Tahoma"/>
+          <w:szCs w:val="21"/>
+        </w:rPr>
+        <w:t>等指标计算，以及性能曲线、扩展性图表和对比报告生成。</w:t>
+      </w:r>
+    </w:p>
+    <w:p>
+      <w:pPr>
+        <w:rPr>
+          <w:rFonts w:ascii="Tahoma" w:hAnsi="Tahoma" w:cs="Tahoma"/>
+          <w:szCs w:val="21"/>
+        </w:rPr>
+      </w:pPr>
+      <w:r>
+        <w:rPr>
+          <w:rFonts w:ascii="Tahoma" w:hAnsi="Tahoma" w:cs="Tahoma"/>
+          <w:b/>
+          <w:bCs/>
+          <w:szCs w:val="21"/>
+        </w:rPr>
+        <w:t xml:space="preserve">AI </w:t>
+      </w:r>
+      <w:r>
+        <w:rPr>
+          <w:rFonts w:ascii="Tahoma" w:hAnsi="Tahoma" w:cs="Tahoma"/>
+          <w:b/>
+          <w:bCs/>
+          <w:szCs w:val="21"/>
+        </w:rPr>
+        <w:t>与</w:t>
+      </w:r>
+      <w:r>
+        <w:rPr>
+          <w:rFonts w:ascii="Tahoma" w:hAnsi="Tahoma" w:cs="Tahoma"/>
+          <w:b/>
+          <w:bCs/>
+          <w:szCs w:val="21"/>
+        </w:rPr>
+        <w:t xml:space="preserve"> Agent </w:t>
+      </w:r>
+      <w:r>
+        <w:rPr>
+          <w:rFonts w:ascii="Tahoma" w:hAnsi="Tahoma" w:cs="Tahoma"/>
+          <w:b/>
+          <w:bCs/>
+          <w:szCs w:val="21"/>
+        </w:rPr>
+        <w:t>应用</w:t>
+      </w:r>
+      <w:r>
+        <w:rPr>
+          <w:rFonts w:ascii="Tahoma" w:hAnsi="Tahoma" w:cs="Tahoma"/>
+          <w:szCs w:val="21"/>
+        </w:rPr>
+        <w:t>：</w:t>
+      </w:r>
+      <w:r>
+        <w:rPr>
+          <w:rFonts w:ascii="Tahoma" w:hAnsi="Tahoma" w:cs="Tahoma"/>
+          <w:szCs w:val="21"/>
+        </w:rPr>
+        <w:t xml:space="preserve"> </w:t>
+      </w:r>
+      <w:r>
+        <w:rPr>
+          <w:rFonts w:ascii="Tahoma" w:hAnsi="Tahoma" w:cs="Tahoma"/>
+          <w:szCs w:val="21"/>
+        </w:rPr>
+        <w:t>熟悉</w:t>
+      </w:r>
+      <w:r>
+        <w:rPr>
+          <w:rFonts w:ascii="Tahoma" w:hAnsi="Tahoma" w:cs="Tahoma"/>
+          <w:szCs w:val="21"/>
+        </w:rPr>
+        <w:t xml:space="preserve"> </w:t>
+      </w:r>
+      <w:proofErr w:type="spellStart"/>
+      <w:r>
+        <w:rPr>
+          <w:rFonts w:ascii="Tahoma" w:hAnsi="Tahoma" w:cs="Tahoma"/>
+          <w:szCs w:val="21"/>
+        </w:rPr>
+        <w:t>PyTorch</w:t>
+      </w:r>
+      <w:proofErr w:type="spellEnd"/>
+      <w:r>
+        <w:rPr>
+          <w:rFonts w:ascii="Tahoma" w:hAnsi="Tahoma" w:cs="Tahoma"/>
+          <w:szCs w:val="21"/>
+        </w:rPr>
+        <w:t>，具备深度学习和多智能体强化学习实验经验；了解</w:t>
+      </w:r>
+      <w:r>
+        <w:rPr>
+          <w:rFonts w:ascii="Tahoma" w:hAnsi="Tahoma" w:cs="Tahoma"/>
+          <w:szCs w:val="21"/>
+        </w:rPr>
+        <w:t xml:space="preserve"> RAG</w:t>
+      </w:r>
+      <w:r>
+        <w:rPr>
+          <w:rFonts w:ascii="Tahoma" w:hAnsi="Tahoma" w:cs="Tahoma"/>
+          <w:szCs w:val="21"/>
+        </w:rPr>
+        <w:t>、向量检索、</w:t>
+      </w:r>
+      <w:r>
+        <w:rPr>
+          <w:rFonts w:ascii="Tahoma" w:hAnsi="Tahoma" w:cs="Tahoma"/>
+          <w:szCs w:val="21"/>
+        </w:rPr>
+        <w:t>embedding</w:t>
+      </w:r>
+      <w:r>
+        <w:rPr>
+          <w:rFonts w:ascii="Tahoma" w:hAnsi="Tahoma" w:cs="Tahoma"/>
+          <w:szCs w:val="21"/>
+        </w:rPr>
+        <w:t>、</w:t>
+      </w:r>
+      <w:r>
+        <w:rPr>
+          <w:rFonts w:ascii="Tahoma" w:hAnsi="Tahoma" w:cs="Tahoma"/>
+          <w:szCs w:val="21"/>
+        </w:rPr>
+        <w:t>FAISS / Chroma</w:t>
+      </w:r>
+      <w:r>
+        <w:rPr>
+          <w:rFonts w:ascii="Tahoma" w:hAnsi="Tahoma" w:cs="Tahoma"/>
+          <w:szCs w:val="21"/>
+        </w:rPr>
+        <w:t>、</w:t>
+      </w:r>
+      <w:proofErr w:type="spellStart"/>
+      <w:r>
+        <w:rPr>
+          <w:rFonts w:ascii="Tahoma" w:hAnsi="Tahoma" w:cs="Tahoma"/>
+          <w:szCs w:val="21"/>
+        </w:rPr>
+        <w:t>LangChain</w:t>
+      </w:r>
+      <w:proofErr w:type="spellEnd"/>
+      <w:r>
+        <w:rPr>
+          <w:rFonts w:ascii="Tahoma" w:hAnsi="Tahoma" w:cs="Tahoma"/>
+          <w:szCs w:val="21"/>
+        </w:rPr>
+        <w:t xml:space="preserve"> / </w:t>
+      </w:r>
+      <w:proofErr w:type="spellStart"/>
+      <w:r>
+        <w:rPr>
+          <w:rFonts w:ascii="Tahoma" w:hAnsi="Tahoma" w:cs="Tahoma"/>
+          <w:szCs w:val="21"/>
+        </w:rPr>
+        <w:t>LlamaIndex</w:t>
+      </w:r>
+      <w:proofErr w:type="spellEnd"/>
+      <w:r>
+        <w:rPr>
+          <w:rFonts w:ascii="Tahoma" w:hAnsi="Tahoma" w:cs="Tahoma"/>
+          <w:szCs w:val="21"/>
+        </w:rPr>
+        <w:t>、</w:t>
+      </w:r>
+      <w:r>
+        <w:rPr>
+          <w:rFonts w:ascii="Tahoma" w:hAnsi="Tahoma" w:cs="Tahoma"/>
+          <w:szCs w:val="21"/>
+        </w:rPr>
+        <w:t>Agent tool calling</w:t>
+      </w:r>
+      <w:r>
+        <w:rPr>
+          <w:rFonts w:ascii="Tahoma" w:hAnsi="Tahoma" w:cs="Tahoma"/>
+          <w:szCs w:val="21"/>
+        </w:rPr>
+        <w:t>、</w:t>
+      </w:r>
+      <w:r>
+        <w:rPr>
+          <w:rFonts w:ascii="Tahoma" w:hAnsi="Tahoma" w:cs="Tahoma"/>
+          <w:szCs w:val="21"/>
+        </w:rPr>
+        <w:t xml:space="preserve">prompt engineering </w:t>
+      </w:r>
+      <w:r>
+        <w:rPr>
+          <w:rFonts w:ascii="Tahoma" w:hAnsi="Tahoma" w:cs="Tahoma"/>
+          <w:szCs w:val="21"/>
+        </w:rPr>
+        <w:t>和</w:t>
+      </w:r>
+      <w:r>
+        <w:rPr>
+          <w:rFonts w:ascii="Tahoma" w:hAnsi="Tahoma" w:cs="Tahoma"/>
+          <w:szCs w:val="21"/>
+        </w:rPr>
+        <w:t xml:space="preserve"> Markdown </w:t>
+      </w:r>
+      <w:r>
+        <w:rPr>
+          <w:rFonts w:ascii="Tahoma" w:hAnsi="Tahoma" w:cs="Tahoma"/>
+          <w:szCs w:val="21"/>
+        </w:rPr>
+        <w:t>报告生成等</w:t>
+      </w:r>
+      <w:r>
+        <w:rPr>
+          <w:rFonts w:ascii="Tahoma" w:hAnsi="Tahoma" w:cs="Tahoma"/>
+          <w:szCs w:val="21"/>
+        </w:rPr>
+        <w:t xml:space="preserve"> AI </w:t>
+      </w:r>
+      <w:r>
+        <w:rPr>
+          <w:rFonts w:ascii="Tahoma" w:hAnsi="Tahoma" w:cs="Tahoma"/>
+          <w:szCs w:val="21"/>
+        </w:rPr>
+        <w:t>应用开发流程。</w:t>
+      </w:r>
+    </w:p>
+    <w:p>
+      <w:pPr>
+        <w:rPr>
+          <w:rFonts w:ascii="Tahoma" w:hAnsi="Tahoma" w:cs="Tahoma"/>
+          <w:b/>
+          <w:bCs/>
+          <w:szCs w:val="21"/>
+        </w:rPr>
+      </w:pPr>
+      <w:r>
+        <w:rPr>
+          <w:rFonts w:ascii="Tahoma" w:hAnsi="Tahoma" w:cs="Tahoma"/>
+          <w:b/>
+          <w:bCs/>
+          <w:szCs w:val="21"/>
+        </w:rPr>
+        <w:t>后端与工程工具：</w:t>
+      </w:r>
+      <w:r>
+        <w:rPr>
+          <w:rFonts w:ascii="Tahoma" w:hAnsi="Tahoma" w:cs="Tahoma"/>
+          <w:szCs w:val="21"/>
+        </w:rPr>
+        <w:t xml:space="preserve"> </w:t>
+      </w:r>
+      <w:r>
+        <w:rPr>
+          <w:rFonts w:ascii="Tahoma" w:hAnsi="Tahoma" w:cs="Tahoma"/>
+          <w:szCs w:val="21"/>
+        </w:rPr>
+        <w:t>了解</w:t>
+      </w:r>
+      <w:r>
+        <w:rPr>
+          <w:rFonts w:ascii="Tahoma" w:hAnsi="Tahoma" w:cs="Tahoma"/>
+          <w:szCs w:val="21"/>
+        </w:rPr>
+        <w:t xml:space="preserve"> </w:t>
+      </w:r>
+      <w:proofErr w:type="spellStart"/>
+      <w:r>
+        <w:rPr>
+          <w:rFonts w:ascii="Tahoma" w:hAnsi="Tahoma" w:cs="Tahoma"/>
+          <w:szCs w:val="21"/>
+        </w:rPr>
+        <w:t>FastAPI</w:t>
+      </w:r>
+      <w:proofErr w:type="spellEnd"/>
+      <w:r>
+        <w:rPr>
+          <w:rFonts w:ascii="Tahoma" w:hAnsi="Tahoma" w:cs="Tahoma"/>
+          <w:szCs w:val="21"/>
+        </w:rPr>
+        <w:t>、</w:t>
+      </w:r>
+      <w:r>
+        <w:rPr>
+          <w:rFonts w:ascii="Tahoma" w:hAnsi="Tahoma" w:cs="Tahoma"/>
+          <w:szCs w:val="21"/>
+        </w:rPr>
+        <w:t>MySQL / SQLite</w:t>
+      </w:r>
+      <w:r>
+        <w:rPr>
+          <w:rFonts w:ascii="Tahoma" w:hAnsi="Tahoma" w:cs="Tahoma"/>
+          <w:szCs w:val="21"/>
+        </w:rPr>
+        <w:t>、</w:t>
+      </w:r>
+      <w:r>
+        <w:rPr>
+          <w:rFonts w:ascii="Tahoma" w:hAnsi="Tahoma" w:cs="Tahoma"/>
+          <w:szCs w:val="21"/>
+        </w:rPr>
+        <w:t>Redis</w:t>
+      </w:r>
+      <w:r>
+        <w:rPr>
+          <w:rFonts w:ascii="Tahoma" w:hAnsi="Tahoma" w:cs="Tahoma"/>
+          <w:szCs w:val="21"/>
+        </w:rPr>
+        <w:t>、</w:t>
+      </w:r>
+      <w:r>
+        <w:rPr>
+          <w:rFonts w:ascii="Tahoma" w:hAnsi="Tahoma" w:cs="Tahoma"/>
+          <w:szCs w:val="21"/>
+        </w:rPr>
+        <w:t>REST API</w:t>
+      </w:r>
+      <w:r>
+        <w:rPr>
+          <w:rFonts w:ascii="Tahoma" w:hAnsi="Tahoma" w:cs="Tahoma"/>
+          <w:szCs w:val="21"/>
+        </w:rPr>
+        <w:t>、</w:t>
+      </w:r>
+      <w:r>
+        <w:rPr>
+          <w:rFonts w:ascii="Tahoma" w:hAnsi="Tahoma" w:cs="Tahoma"/>
+          <w:szCs w:val="21"/>
+        </w:rPr>
+        <w:t>HTTP</w:t>
+      </w:r>
+      <w:r>
+        <w:rPr>
+          <w:rFonts w:ascii="Tahoma" w:hAnsi="Tahoma" w:cs="Tahoma"/>
+          <w:szCs w:val="21"/>
+        </w:rPr>
+        <w:t>、</w:t>
+      </w:r>
+      <w:r>
+        <w:rPr>
+          <w:rFonts w:ascii="Tahoma" w:hAnsi="Tahoma" w:cs="Tahoma"/>
+          <w:szCs w:val="21"/>
+        </w:rPr>
+        <w:t>TCP</w:t>
+      </w:r>
+      <w:r>
+        <w:rPr>
+          <w:rFonts w:ascii="Tahoma" w:hAnsi="Tahoma" w:cs="Tahoma"/>
+          <w:szCs w:val="21"/>
+        </w:rPr>
+        <w:t>、</w:t>
+      </w:r>
+      <w:r>
+        <w:rPr>
+          <w:rFonts w:ascii="Tahoma" w:hAnsi="Tahoma" w:cs="Tahoma"/>
+          <w:szCs w:val="21"/>
+        </w:rPr>
+        <w:t xml:space="preserve">UDP </w:t>
+      </w:r>
+      <w:r>
+        <w:rPr>
+          <w:rFonts w:ascii="Tahoma" w:hAnsi="Tahoma" w:cs="Tahoma"/>
+          <w:szCs w:val="21"/>
+        </w:rPr>
+        <w:t>等后端与网络基础；理解索引、事务、锁、查询优化、缓存</w:t>
+      </w:r>
+      <w:r>
+        <w:rPr>
+          <w:rFonts w:ascii="Tahoma" w:hAnsi="Tahoma" w:cs="Tahoma"/>
+          <w:szCs w:val="21"/>
+        </w:rPr>
+        <w:t xml:space="preserve"> TTL</w:t>
+      </w:r>
+      <w:r>
+        <w:rPr>
+          <w:rFonts w:ascii="Tahoma" w:hAnsi="Tahoma" w:cs="Tahoma"/>
+          <w:szCs w:val="21"/>
+        </w:rPr>
+        <w:t>、缓存穿透、缓存击穿、日志追踪和</w:t>
+      </w:r>
+      <w:r>
+        <w:rPr>
+          <w:rFonts w:ascii="Tahoma" w:hAnsi="Tahoma" w:cs="Tahoma"/>
+          <w:szCs w:val="21"/>
+        </w:rPr>
+        <w:t xml:space="preserve"> </w:t>
+      </w:r>
+      <w:proofErr w:type="spellStart"/>
+      <w:r>
+        <w:rPr>
+          <w:rFonts w:ascii="Tahoma" w:hAnsi="Tahoma" w:cs="Tahoma"/>
+          <w:szCs w:val="21"/>
+        </w:rPr>
+        <w:t>TraceID</w:t>
+      </w:r>
+      <w:proofErr w:type="spellEnd"/>
+      <w:r>
+        <w:rPr>
+          <w:rFonts w:ascii="Tahoma" w:hAnsi="Tahoma" w:cs="Tahoma"/>
+          <w:szCs w:val="21"/>
+        </w:rPr>
+        <w:t xml:space="preserve"> </w:t>
+      </w:r>
+      <w:r>
+        <w:rPr>
+          <w:rFonts w:ascii="Tahoma" w:hAnsi="Tahoma" w:cs="Tahoma"/>
+          <w:szCs w:val="21"/>
+        </w:rPr>
+        <w:t>等工程概念；熟悉</w:t>
+      </w:r>
+      <w:r>
+        <w:rPr>
+          <w:rFonts w:ascii="Tahoma" w:hAnsi="Tahoma" w:cs="Tahoma"/>
+          <w:szCs w:val="21"/>
+        </w:rPr>
+        <w:t xml:space="preserve"> Linux</w:t>
+      </w:r>
+      <w:r>
+        <w:rPr>
+          <w:rFonts w:ascii="Tahoma" w:hAnsi="Tahoma" w:cs="Tahoma"/>
+          <w:szCs w:val="21"/>
+        </w:rPr>
+        <w:t>、</w:t>
+      </w:r>
+      <w:r>
+        <w:rPr>
+          <w:rFonts w:ascii="Tahoma" w:hAnsi="Tahoma" w:cs="Tahoma"/>
+          <w:szCs w:val="21"/>
+        </w:rPr>
+        <w:t>Bash</w:t>
+      </w:r>
+      <w:r>
+        <w:rPr>
+          <w:rFonts w:ascii="Tahoma" w:hAnsi="Tahoma" w:cs="Tahoma"/>
+          <w:szCs w:val="21"/>
+        </w:rPr>
+        <w:t>、</w:t>
+      </w:r>
+      <w:r>
+        <w:rPr>
+          <w:rFonts w:ascii="Tahoma" w:hAnsi="Tahoma" w:cs="Tahoma"/>
+          <w:szCs w:val="21"/>
+        </w:rPr>
+        <w:t>Git</w:t>
+      </w:r>
+      <w:r>
+        <w:rPr>
+          <w:rFonts w:ascii="Tahoma" w:hAnsi="Tahoma" w:cs="Tahoma"/>
+          <w:szCs w:val="21"/>
+        </w:rPr>
+        <w:t>、</w:t>
+      </w:r>
+      <w:r>
+        <w:rPr>
+          <w:rFonts w:ascii="Tahoma" w:hAnsi="Tahoma" w:cs="Tahoma"/>
+          <w:szCs w:val="21"/>
+        </w:rPr>
+        <w:t>VS Code</w:t>
+      </w:r>
+      <w:r>
+        <w:rPr>
+          <w:rFonts w:ascii="Tahoma" w:hAnsi="Tahoma" w:cs="Tahoma"/>
+          <w:szCs w:val="21"/>
+        </w:rPr>
+        <w:t>、</w:t>
+      </w:r>
+      <w:r>
+        <w:rPr>
+          <w:rFonts w:ascii="Tahoma" w:hAnsi="Tahoma" w:cs="Tahoma"/>
+          <w:szCs w:val="21"/>
+        </w:rPr>
+        <w:t xml:space="preserve">Docker </w:t>
+      </w:r>
+      <w:r>
+        <w:rPr>
+          <w:rFonts w:ascii="Tahoma" w:hAnsi="Tahoma" w:cs="Tahoma"/>
+          <w:szCs w:val="21"/>
+        </w:rPr>
+        <w:t>基础操作</w:t>
+      </w:r>
+      <w:r>
+        <w:rPr>
+          <w:rFonts w:ascii="Tahoma" w:hAnsi="Tahoma" w:cs="Tahoma"/>
+          <w:b/>
+          <w:bCs/>
+          <w:szCs w:val="21"/>
+        </w:rPr>
+        <w:t>。</w:t>
+      </w:r>
+    </w:p>
+    <w:p>
+      <w:pPr>
+        <w:rPr>
+          <w:rFonts w:ascii="Tahoma" w:hAnsi="Tahoma" w:cs="Tahoma"/>
+          <w:szCs w:val="21"/>
+        </w:rPr>
+      </w:pPr>
+      <w:r>
+        <w:rPr>
+          <w:rFonts w:ascii="Tahoma" w:hAnsi="Tahoma" w:cs="Tahoma"/>
+          <w:szCs w:val="21"/>
+        </w:rPr>
+        <w:pict w14:anchorId="57998551">
+          <v:rect id="_x0000_i1037" style="width:0;height:1.5pt" o:hralign="center" o:hrstd="t" o:hr="t" fillcolor="#a0a0a0" stroked="f"/>
+        </w:pict>
+      </w:r>
+    </w:p>
+    <w:p>
+      <w:pPr>
         <w:rPr>
           <w:rFonts w:ascii="Tahoma" w:hAnsi="Tahoma" w:cs="Tahoma"/>
           <w:b/>
@@ -330,1043 +1387,55 @@
           <w:sz w:val="24"/>
           <w:szCs w:val="24"/>
         </w:rPr>
-        <w:t>技术能力</w:t>
+        <w:t>项目经历</w:t>
       </w:r>
     </w:p>
     <w:p>
       <w:pPr>
         <w:rPr>
           <w:rFonts w:ascii="Tahoma" w:hAnsi="Tahoma" w:cs="Tahoma"/>
-          <w:szCs w:val="21"/>
-        </w:rPr>
-      </w:pPr>
-      <w:r>
-        <w:rPr>
-          <w:rFonts w:ascii="Tahoma" w:hAnsi="Tahoma" w:cs="Tahoma"/>
-          <w:b/>
-          <w:bCs/>
-          <w:szCs w:val="21"/>
-        </w:rPr>
-        <w:t>编程语言</w:t>
-      </w:r>
-      <w:r>
-        <w:rPr>
-          <w:rFonts w:ascii="Tahoma" w:hAnsi="Tahoma" w:cs="Tahoma"/>
-          <w:szCs w:val="21"/>
-        </w:rPr>
-        <w:t>：</w:t>
-      </w:r>
-      <w:r>
-        <w:rPr>
-          <w:rFonts w:ascii="Tahoma" w:hAnsi="Tahoma" w:cs="Tahoma"/>
-          <w:szCs w:val="21"/>
+          <w:b/>
+          <w:bCs/>
+          <w:sz w:val="22"/>
+        </w:rPr>
+      </w:pPr>
+      <w:r>
+        <w:rPr>
+          <w:rFonts w:ascii="Tahoma" w:hAnsi="Tahoma" w:cs="Tahoma"/>
+          <w:b/>
+          <w:bCs/>
+          <w:sz w:val="22"/>
+        </w:rPr>
+        <w:t>面向</w:t>
+      </w:r>
+      <w:r>
+        <w:rPr>
+          <w:rFonts w:ascii="Tahoma" w:hAnsi="Tahoma" w:cs="Tahoma"/>
+          <w:b/>
+          <w:bCs/>
+          <w:sz w:val="22"/>
         </w:rPr>
         <w:t xml:space="preserve"> </w:t>
       </w:r>
-      <w:r>
-        <w:rPr>
-          <w:rFonts w:ascii="Tahoma" w:hAnsi="Tahoma" w:cs="Tahoma"/>
-          <w:szCs w:val="21"/>
-        </w:rPr>
-        <w:t>熟悉</w:t>
-      </w:r>
-      <w:r>
-        <w:rPr>
-          <w:rFonts w:ascii="Tahoma" w:hAnsi="Tahoma" w:cs="Tahoma"/>
-          <w:szCs w:val="21"/>
-        </w:rPr>
-        <w:t xml:space="preserve"> C/C++</w:t>
-      </w:r>
-      <w:r>
-        <w:rPr>
-          <w:rFonts w:ascii="Tahoma" w:hAnsi="Tahoma" w:cs="Tahoma"/>
-          <w:szCs w:val="21"/>
-        </w:rPr>
-        <w:t>、</w:t>
-      </w:r>
-      <w:r>
-        <w:rPr>
-          <w:rFonts w:ascii="Tahoma" w:hAnsi="Tahoma" w:cs="Tahoma"/>
-          <w:szCs w:val="21"/>
-        </w:rPr>
-        <w:t>Python</w:t>
-      </w:r>
-      <w:r>
-        <w:rPr>
-          <w:rFonts w:ascii="Tahoma" w:hAnsi="Tahoma" w:cs="Tahoma"/>
-          <w:szCs w:val="21"/>
-        </w:rPr>
-        <w:t>，具备数值计算程序、并行程序、性能测试代码和自动化分析脚本开发经验；掌握</w:t>
-      </w:r>
-      <w:r>
-        <w:rPr>
-          <w:rFonts w:ascii="Tahoma" w:hAnsi="Tahoma" w:cs="Tahoma"/>
-          <w:szCs w:val="21"/>
-        </w:rPr>
-        <w:t xml:space="preserve"> SQL </w:t>
-      </w:r>
-      <w:r>
-        <w:rPr>
-          <w:rFonts w:ascii="Tahoma" w:hAnsi="Tahoma" w:cs="Tahoma"/>
-          <w:szCs w:val="21"/>
-        </w:rPr>
-        <w:t>基础，能够完成实验数据建模、查询与分析；了解</w:t>
-      </w:r>
-      <w:r>
-        <w:rPr>
-          <w:rFonts w:ascii="Tahoma" w:hAnsi="Tahoma" w:cs="Tahoma"/>
-          <w:szCs w:val="21"/>
-        </w:rPr>
-        <w:t xml:space="preserve"> JavaScript</w:t>
-      </w:r>
-      <w:r>
-        <w:rPr>
-          <w:rFonts w:ascii="Tahoma" w:hAnsi="Tahoma" w:cs="Tahoma"/>
-          <w:szCs w:val="21"/>
-        </w:rPr>
-        <w:t>、</w:t>
-      </w:r>
-      <w:r>
-        <w:rPr>
-          <w:rFonts w:ascii="Tahoma" w:hAnsi="Tahoma" w:cs="Tahoma"/>
-          <w:szCs w:val="21"/>
-        </w:rPr>
-        <w:t>HTML</w:t>
-      </w:r>
-      <w:r>
-        <w:rPr>
-          <w:rFonts w:ascii="Tahoma" w:hAnsi="Tahoma" w:cs="Tahoma"/>
-          <w:szCs w:val="21"/>
-        </w:rPr>
-        <w:t>、</w:t>
-      </w:r>
-      <w:r>
-        <w:rPr>
-          <w:rFonts w:ascii="Tahoma" w:hAnsi="Tahoma" w:cs="Tahoma"/>
-          <w:szCs w:val="21"/>
-        </w:rPr>
-        <w:t>CSS</w:t>
-      </w:r>
-      <w:r>
-        <w:rPr>
-          <w:rFonts w:ascii="Tahoma" w:hAnsi="Tahoma" w:cs="Tahoma"/>
-          <w:szCs w:val="21"/>
-        </w:rPr>
-        <w:t>，可配合完成基础</w:t>
-      </w:r>
-      <w:r>
-        <w:rPr>
-          <w:rFonts w:ascii="Tahoma" w:hAnsi="Tahoma" w:cs="Tahoma"/>
-          <w:szCs w:val="21"/>
-        </w:rPr>
-        <w:t xml:space="preserve"> Web </w:t>
-      </w:r>
-      <w:r>
-        <w:rPr>
-          <w:rFonts w:ascii="Tahoma" w:hAnsi="Tahoma" w:cs="Tahoma"/>
-          <w:szCs w:val="21"/>
-        </w:rPr>
-        <w:t>展示与系统原型开发。</w:t>
-      </w:r>
-    </w:p>
-    <w:p>
-      <w:pPr>
-        <w:rPr>
-          <w:rFonts w:ascii="Tahoma" w:hAnsi="Tahoma" w:cs="Tahoma"/>
-          <w:szCs w:val="21"/>
-        </w:rPr>
-      </w:pPr>
-      <w:r>
-        <w:rPr>
-          <w:rFonts w:ascii="Tahoma" w:hAnsi="Tahoma" w:cs="Tahoma"/>
-          <w:b/>
-          <w:bCs/>
-          <w:szCs w:val="21"/>
-        </w:rPr>
-        <w:t>高性能计算</w:t>
-      </w:r>
-      <w:r>
-        <w:rPr>
-          <w:rFonts w:ascii="Tahoma" w:hAnsi="Tahoma" w:cs="Tahoma"/>
-          <w:szCs w:val="21"/>
-        </w:rPr>
-        <w:t>：</w:t>
-      </w:r>
-      <w:r>
-        <w:rPr>
-          <w:rFonts w:ascii="Tahoma" w:hAnsi="Tahoma" w:cs="Tahoma"/>
-          <w:szCs w:val="21"/>
+      <w:proofErr w:type="spellStart"/>
+      <w:r>
+        <w:rPr>
+          <w:rFonts w:ascii="Tahoma" w:hAnsi="Tahoma" w:cs="Tahoma"/>
+          <w:b/>
+          <w:bCs/>
+          <w:sz w:val="22"/>
+        </w:rPr>
+        <w:t>PETSc</w:t>
+      </w:r>
+      <w:proofErr w:type="spellEnd"/>
+      <w:r>
+        <w:rPr>
+          <w:rFonts w:ascii="Tahoma" w:hAnsi="Tahoma" w:cs="Tahoma"/>
+          <w:b/>
+          <w:bCs/>
+          <w:sz w:val="22"/>
         </w:rPr>
         <w:t xml:space="preserve"> </w:t>
-      </w:r>
-      <w:r>
-        <w:rPr>
-          <w:rFonts w:ascii="Tahoma" w:hAnsi="Tahoma" w:cs="Tahoma"/>
-          <w:szCs w:val="21"/>
-        </w:rPr>
-        <w:t>熟悉</w:t>
-      </w:r>
-      <w:r>
-        <w:rPr>
-          <w:rFonts w:ascii="Tahoma" w:hAnsi="Tahoma" w:cs="Tahoma"/>
-          <w:szCs w:val="21"/>
-        </w:rPr>
-        <w:t xml:space="preserve"> MPI</w:t>
-      </w:r>
-      <w:r>
-        <w:rPr>
-          <w:rFonts w:ascii="Tahoma" w:hAnsi="Tahoma" w:cs="Tahoma"/>
-          <w:szCs w:val="21"/>
-        </w:rPr>
-        <w:t>、</w:t>
-      </w:r>
-      <w:r>
-        <w:rPr>
-          <w:rFonts w:ascii="Tahoma" w:hAnsi="Tahoma" w:cs="Tahoma"/>
-          <w:szCs w:val="21"/>
-        </w:rPr>
-        <w:t>OpenMP</w:t>
-      </w:r>
-      <w:r>
-        <w:rPr>
-          <w:rFonts w:ascii="Tahoma" w:hAnsi="Tahoma" w:cs="Tahoma"/>
-          <w:szCs w:val="21"/>
-        </w:rPr>
-        <w:t>、</w:t>
-      </w:r>
-      <w:r>
-        <w:rPr>
-          <w:rFonts w:ascii="Tahoma" w:hAnsi="Tahoma" w:cs="Tahoma"/>
-          <w:szCs w:val="21"/>
-        </w:rPr>
-        <w:t>PETSc</w:t>
-      </w:r>
-      <w:r>
-        <w:rPr>
-          <w:rFonts w:ascii="Tahoma" w:hAnsi="Tahoma" w:cs="Tahoma"/>
-          <w:szCs w:val="21"/>
-        </w:rPr>
-        <w:t>、</w:t>
-      </w:r>
-      <w:r>
-        <w:rPr>
-          <w:rFonts w:ascii="Tahoma" w:hAnsi="Tahoma" w:cs="Tahoma"/>
-          <w:szCs w:val="21"/>
-        </w:rPr>
-        <w:t>Slurm</w:t>
-      </w:r>
-      <w:r>
-        <w:rPr>
-          <w:rFonts w:ascii="Tahoma" w:hAnsi="Tahoma" w:cs="Tahoma"/>
-          <w:szCs w:val="21"/>
-        </w:rPr>
-        <w:t>，具备在</w:t>
-      </w:r>
-      <w:r>
-        <w:rPr>
-          <w:rFonts w:ascii="Tahoma" w:hAnsi="Tahoma" w:cs="Tahoma"/>
-          <w:szCs w:val="21"/>
-        </w:rPr>
-        <w:t xml:space="preserve"> </w:t>
-      </w:r>
-      <w:r>
-        <w:rPr>
-          <w:rFonts w:ascii="Tahoma" w:hAnsi="Tahoma" w:cs="Tahoma"/>
-          <w:b/>
-          <w:bCs/>
-          <w:szCs w:val="21"/>
-        </w:rPr>
-        <w:t xml:space="preserve">ARCHER2 </w:t>
-      </w:r>
-      <w:r>
-        <w:rPr>
-          <w:rFonts w:ascii="Tahoma" w:hAnsi="Tahoma" w:cs="Tahoma"/>
-          <w:b/>
-          <w:bCs/>
-          <w:szCs w:val="21"/>
-        </w:rPr>
-        <w:t>超算平台</w:t>
-      </w:r>
-      <w:r>
-        <w:rPr>
-          <w:rFonts w:ascii="Tahoma" w:hAnsi="Tahoma" w:cs="Tahoma"/>
-          <w:szCs w:val="21"/>
-        </w:rPr>
-        <w:t>上进行大规模并行实验、作业调度、日志分析和性能评估的经验；理解</w:t>
-      </w:r>
-      <w:r>
-        <w:rPr>
-          <w:rFonts w:ascii="Tahoma" w:hAnsi="Tahoma" w:cs="Tahoma"/>
-          <w:szCs w:val="21"/>
-        </w:rPr>
-        <w:t xml:space="preserve"> MPI </w:t>
-      </w:r>
-      <w:r>
-        <w:rPr>
-          <w:rFonts w:ascii="Tahoma" w:hAnsi="Tahoma" w:cs="Tahoma"/>
-          <w:szCs w:val="21"/>
-        </w:rPr>
-        <w:t>进程通信、</w:t>
-      </w:r>
-      <w:r>
-        <w:rPr>
-          <w:rFonts w:ascii="Tahoma" w:hAnsi="Tahoma" w:cs="Tahoma"/>
-          <w:szCs w:val="21"/>
-        </w:rPr>
-        <w:t xml:space="preserve">OpenMP </w:t>
-      </w:r>
-      <w:r>
-        <w:rPr>
-          <w:rFonts w:ascii="Tahoma" w:hAnsi="Tahoma" w:cs="Tahoma"/>
-          <w:szCs w:val="21"/>
-        </w:rPr>
-        <w:t>线程并行、</w:t>
-      </w:r>
-      <w:r>
-        <w:rPr>
-          <w:rFonts w:ascii="Tahoma" w:hAnsi="Tahoma" w:cs="Tahoma"/>
-          <w:szCs w:val="21"/>
-        </w:rPr>
-        <w:t>hybrid MPI+OpenMP</w:t>
-      </w:r>
-      <w:r>
-        <w:rPr>
-          <w:rFonts w:ascii="Tahoma" w:hAnsi="Tahoma" w:cs="Tahoma"/>
-          <w:szCs w:val="21"/>
-        </w:rPr>
-        <w:t>、</w:t>
-      </w:r>
-      <w:r>
-        <w:rPr>
-          <w:rFonts w:ascii="Tahoma" w:hAnsi="Tahoma" w:cs="Tahoma"/>
-          <w:szCs w:val="21"/>
-        </w:rPr>
-        <w:t>strong scaling</w:t>
-      </w:r>
-      <w:r>
-        <w:rPr>
-          <w:rFonts w:ascii="Tahoma" w:hAnsi="Tahoma" w:cs="Tahoma"/>
-          <w:szCs w:val="21"/>
-        </w:rPr>
-        <w:t>、</w:t>
-      </w:r>
-      <w:r>
-        <w:rPr>
-          <w:rFonts w:ascii="Tahoma" w:hAnsi="Tahoma" w:cs="Tahoma"/>
-          <w:szCs w:val="21"/>
-        </w:rPr>
-        <w:t>weak scaling</w:t>
-      </w:r>
-      <w:r>
-        <w:rPr>
-          <w:rFonts w:ascii="Tahoma" w:hAnsi="Tahoma" w:cs="Tahoma"/>
-          <w:szCs w:val="21"/>
-        </w:rPr>
-        <w:t>、</w:t>
-      </w:r>
-      <w:r>
-        <w:rPr>
-          <w:rFonts w:ascii="Tahoma" w:hAnsi="Tahoma" w:cs="Tahoma"/>
-          <w:szCs w:val="21"/>
-        </w:rPr>
-        <w:t>speedup</w:t>
-      </w:r>
-      <w:r>
-        <w:rPr>
-          <w:rFonts w:ascii="Tahoma" w:hAnsi="Tahoma" w:cs="Tahoma"/>
-          <w:szCs w:val="21"/>
-        </w:rPr>
-        <w:t>、</w:t>
-      </w:r>
-      <w:r>
-        <w:rPr>
-          <w:rFonts w:ascii="Tahoma" w:hAnsi="Tahoma" w:cs="Tahoma"/>
-          <w:szCs w:val="21"/>
-        </w:rPr>
-        <w:t xml:space="preserve">parallel efficiency </w:t>
-      </w:r>
-      <w:r>
-        <w:rPr>
-          <w:rFonts w:ascii="Tahoma" w:hAnsi="Tahoma" w:cs="Tahoma"/>
-          <w:szCs w:val="21"/>
-        </w:rPr>
-        <w:t>等概念。</w:t>
-      </w:r>
-    </w:p>
-    <w:p>
-      <w:pPr>
-        <w:rPr>
-          <w:rFonts w:ascii="Tahoma" w:hAnsi="Tahoma" w:cs="Tahoma"/>
-          <w:szCs w:val="21"/>
-        </w:rPr>
-      </w:pPr>
-      <w:r>
-        <w:rPr>
-          <w:rFonts w:ascii="Tahoma" w:hAnsi="Tahoma" w:cs="Tahoma"/>
-          <w:b/>
-          <w:bCs/>
-          <w:szCs w:val="21"/>
-        </w:rPr>
-        <w:t>性能分析与系统基础</w:t>
-      </w:r>
-      <w:r>
-        <w:rPr>
-          <w:rFonts w:ascii="Tahoma" w:hAnsi="Tahoma" w:cs="Tahoma"/>
-          <w:szCs w:val="21"/>
-        </w:rPr>
-        <w:t>：</w:t>
-      </w:r>
-      <w:r>
-        <w:rPr>
-          <w:rFonts w:ascii="Tahoma" w:hAnsi="Tahoma" w:cs="Tahoma"/>
-          <w:szCs w:val="21"/>
-        </w:rPr>
-        <w:t xml:space="preserve"> </w:t>
-      </w:r>
-      <w:r>
-        <w:rPr>
-          <w:rFonts w:ascii="Tahoma" w:hAnsi="Tahoma" w:cs="Tahoma"/>
-          <w:szCs w:val="21"/>
-        </w:rPr>
-        <w:t>理解进程、线程、上下文切换、同步开销、通信开销、</w:t>
-      </w:r>
-      <w:r>
-        <w:rPr>
-          <w:rFonts w:ascii="Tahoma" w:hAnsi="Tahoma" w:cs="Tahoma"/>
-          <w:szCs w:val="21"/>
-        </w:rPr>
-        <w:t xml:space="preserve">I/O </w:t>
-      </w:r>
-      <w:r>
-        <w:rPr>
-          <w:rFonts w:ascii="Tahoma" w:hAnsi="Tahoma" w:cs="Tahoma"/>
-          <w:szCs w:val="21"/>
-        </w:rPr>
-        <w:t>开销、内存访问、</w:t>
-      </w:r>
-      <w:r>
-        <w:rPr>
-          <w:rFonts w:ascii="Tahoma" w:hAnsi="Tahoma" w:cs="Tahoma"/>
-          <w:szCs w:val="21"/>
-        </w:rPr>
-        <w:t>Cache locality</w:t>
-      </w:r>
-      <w:r>
-        <w:rPr>
-          <w:rFonts w:ascii="Tahoma" w:hAnsi="Tahoma" w:cs="Tahoma"/>
-          <w:szCs w:val="21"/>
-        </w:rPr>
-        <w:t>、</w:t>
-      </w:r>
-      <w:r>
-        <w:rPr>
-          <w:rFonts w:ascii="Tahoma" w:hAnsi="Tahoma" w:cs="Tahoma"/>
-          <w:szCs w:val="21"/>
-        </w:rPr>
-        <w:t>NUMA</w:t>
-      </w:r>
-      <w:r>
-        <w:rPr>
-          <w:rFonts w:ascii="Tahoma" w:hAnsi="Tahoma" w:cs="Tahoma"/>
-          <w:szCs w:val="21"/>
-        </w:rPr>
-        <w:t>、负载均衡等基础概念，能够从计算、通信、内存访问和线程调度角度分析程序性能瓶颈。</w:t>
-      </w:r>
-    </w:p>
-    <w:p>
-      <w:pPr>
-        <w:rPr>
-          <w:rFonts w:ascii="Tahoma" w:hAnsi="Tahoma" w:cs="Tahoma"/>
-          <w:szCs w:val="21"/>
-        </w:rPr>
-      </w:pPr>
-      <w:r>
-        <w:rPr>
-          <w:rFonts w:ascii="Tahoma" w:hAnsi="Tahoma" w:cs="Tahoma"/>
-          <w:b/>
-          <w:bCs/>
-          <w:szCs w:val="21"/>
-        </w:rPr>
-        <w:t>数据处理与可视化：</w:t>
-      </w:r>
-      <w:r>
-        <w:rPr>
-          <w:rFonts w:ascii="Tahoma" w:hAnsi="Tahoma" w:cs="Tahoma"/>
-          <w:szCs w:val="21"/>
-        </w:rPr>
-        <w:t xml:space="preserve"> </w:t>
-      </w:r>
-      <w:r>
-        <w:rPr>
-          <w:rFonts w:ascii="Tahoma" w:hAnsi="Tahoma" w:cs="Tahoma"/>
-          <w:szCs w:val="21"/>
-        </w:rPr>
-        <w:t>熟悉</w:t>
-      </w:r>
-      <w:r>
-        <w:rPr>
-          <w:rFonts w:ascii="Tahoma" w:hAnsi="Tahoma" w:cs="Tahoma"/>
-          <w:szCs w:val="21"/>
-        </w:rPr>
-        <w:t xml:space="preserve"> Pandas</w:t>
-      </w:r>
-      <w:r>
-        <w:rPr>
-          <w:rFonts w:ascii="Tahoma" w:hAnsi="Tahoma" w:cs="Tahoma"/>
-          <w:szCs w:val="21"/>
-        </w:rPr>
-        <w:t>、</w:t>
-      </w:r>
-      <w:r>
-        <w:rPr>
-          <w:rFonts w:ascii="Tahoma" w:hAnsi="Tahoma" w:cs="Tahoma"/>
-          <w:szCs w:val="21"/>
-        </w:rPr>
-        <w:t>NumPy</w:t>
-      </w:r>
-      <w:r>
-        <w:rPr>
-          <w:rFonts w:ascii="Tahoma" w:hAnsi="Tahoma" w:cs="Tahoma"/>
-          <w:szCs w:val="21"/>
-        </w:rPr>
-        <w:t>、</w:t>
-      </w:r>
-      <w:r>
-        <w:rPr>
-          <w:rFonts w:ascii="Tahoma" w:hAnsi="Tahoma" w:cs="Tahoma"/>
-          <w:szCs w:val="21"/>
-        </w:rPr>
-        <w:t>Matplotlib</w:t>
-      </w:r>
-      <w:r>
-        <w:rPr>
-          <w:rFonts w:ascii="Tahoma" w:hAnsi="Tahoma" w:cs="Tahoma"/>
-          <w:szCs w:val="21"/>
-        </w:rPr>
-        <w:t>，可完成实验日志解析、</w:t>
-      </w:r>
-      <w:r>
-        <w:rPr>
-          <w:rFonts w:ascii="Tahoma" w:hAnsi="Tahoma" w:cs="Tahoma"/>
-          <w:szCs w:val="21"/>
-        </w:rPr>
-        <w:t xml:space="preserve">CSV </w:t>
-      </w:r>
-      <w:r>
-        <w:rPr>
-          <w:rFonts w:ascii="Tahoma" w:hAnsi="Tahoma" w:cs="Tahoma"/>
-          <w:szCs w:val="21"/>
-        </w:rPr>
-        <w:t>数据整理、</w:t>
-      </w:r>
-      <w:r>
-        <w:rPr>
-          <w:rFonts w:ascii="Tahoma" w:hAnsi="Tahoma" w:cs="Tahoma"/>
-          <w:szCs w:val="21"/>
-        </w:rPr>
-        <w:t xml:space="preserve">runtime / speedup / parallel efficiency </w:t>
-      </w:r>
-      <w:r>
-        <w:rPr>
-          <w:rFonts w:ascii="Tahoma" w:hAnsi="Tahoma" w:cs="Tahoma"/>
-          <w:szCs w:val="21"/>
-        </w:rPr>
-        <w:t>等指标计算，以及性能曲线、扩展性图表和对比报告生成。</w:t>
-      </w:r>
-    </w:p>
-    <w:p>
-      <w:pPr>
-        <w:rPr>
-          <w:rFonts w:ascii="Tahoma" w:hAnsi="Tahoma" w:cs="Tahoma"/>
-          <w:szCs w:val="21"/>
-        </w:rPr>
-      </w:pPr>
-      <w:r>
-        <w:rPr>
-          <w:rFonts w:ascii="Tahoma" w:hAnsi="Tahoma" w:cs="Tahoma"/>
-          <w:b/>
-          <w:bCs/>
-          <w:szCs w:val="21"/>
-        </w:rPr>
-        <w:t xml:space="preserve">AI </w:t>
-      </w:r>
-      <w:r>
-        <w:rPr>
-          <w:rFonts w:ascii="Tahoma" w:hAnsi="Tahoma" w:cs="Tahoma"/>
-          <w:b/>
-          <w:bCs/>
-          <w:szCs w:val="21"/>
-        </w:rPr>
-        <w:t>与</w:t>
-      </w:r>
-      <w:r>
-        <w:rPr>
-          <w:rFonts w:ascii="Tahoma" w:hAnsi="Tahoma" w:cs="Tahoma"/>
-          <w:b/>
-          <w:bCs/>
-          <w:szCs w:val="21"/>
-        </w:rPr>
-        <w:t xml:space="preserve"> Agent </w:t>
-      </w:r>
-      <w:r>
-        <w:rPr>
-          <w:rFonts w:ascii="Tahoma" w:hAnsi="Tahoma" w:cs="Tahoma"/>
-          <w:b/>
-          <w:bCs/>
-          <w:szCs w:val="21"/>
-        </w:rPr>
-        <w:t>应用</w:t>
-      </w:r>
-      <w:r>
-        <w:rPr>
-          <w:rFonts w:ascii="Tahoma" w:hAnsi="Tahoma" w:cs="Tahoma"/>
-          <w:szCs w:val="21"/>
-        </w:rPr>
-        <w:t>：</w:t>
-      </w:r>
-      <w:r>
-        <w:rPr>
-          <w:rFonts w:ascii="Tahoma" w:hAnsi="Tahoma" w:cs="Tahoma"/>
-          <w:szCs w:val="21"/>
-        </w:rPr>
-        <w:t xml:space="preserve"> </w:t>
-      </w:r>
-      <w:r>
-        <w:rPr>
-          <w:rFonts w:ascii="Tahoma" w:hAnsi="Tahoma" w:cs="Tahoma"/>
-          <w:szCs w:val="21"/>
-        </w:rPr>
-        <w:t>熟悉</w:t>
-      </w:r>
-      <w:r>
-        <w:rPr>
-          <w:rFonts w:ascii="Tahoma" w:hAnsi="Tahoma" w:cs="Tahoma"/>
-          <w:szCs w:val="21"/>
-        </w:rPr>
-        <w:t xml:space="preserve"> PyTorch</w:t>
-      </w:r>
-      <w:r>
-        <w:rPr>
-          <w:rFonts w:ascii="Tahoma" w:hAnsi="Tahoma" w:cs="Tahoma"/>
-          <w:szCs w:val="21"/>
-        </w:rPr>
-        <w:t>，具备深度学习和多智能体强化学习实验经验；了解</w:t>
-      </w:r>
-      <w:r>
-        <w:rPr>
-          <w:rFonts w:ascii="Tahoma" w:hAnsi="Tahoma" w:cs="Tahoma"/>
-          <w:szCs w:val="21"/>
-        </w:rPr>
-        <w:t xml:space="preserve"> RAG</w:t>
-      </w:r>
-      <w:r>
-        <w:rPr>
-          <w:rFonts w:ascii="Tahoma" w:hAnsi="Tahoma" w:cs="Tahoma"/>
-          <w:szCs w:val="21"/>
-        </w:rPr>
-        <w:t>、向量检索、</w:t>
-      </w:r>
-      <w:r>
-        <w:rPr>
-          <w:rFonts w:ascii="Tahoma" w:hAnsi="Tahoma" w:cs="Tahoma"/>
-          <w:szCs w:val="21"/>
-        </w:rPr>
-        <w:t>embedding</w:t>
-      </w:r>
-      <w:r>
-        <w:rPr>
-          <w:rFonts w:ascii="Tahoma" w:hAnsi="Tahoma" w:cs="Tahoma"/>
-          <w:szCs w:val="21"/>
-        </w:rPr>
-        <w:t>、</w:t>
-      </w:r>
-      <w:r>
-        <w:rPr>
-          <w:rFonts w:ascii="Tahoma" w:hAnsi="Tahoma" w:cs="Tahoma"/>
-          <w:szCs w:val="21"/>
-        </w:rPr>
-        <w:t>FAISS / Chroma</w:t>
-      </w:r>
-      <w:r>
-        <w:rPr>
-          <w:rFonts w:ascii="Tahoma" w:hAnsi="Tahoma" w:cs="Tahoma"/>
-          <w:szCs w:val="21"/>
-        </w:rPr>
-        <w:t>、</w:t>
-      </w:r>
-      <w:r>
-        <w:rPr>
-          <w:rFonts w:ascii="Tahoma" w:hAnsi="Tahoma" w:cs="Tahoma"/>
-          <w:szCs w:val="21"/>
-        </w:rPr>
-        <w:t>LangChain / LlamaIndex</w:t>
-      </w:r>
-      <w:r>
-        <w:rPr>
-          <w:rFonts w:ascii="Tahoma" w:hAnsi="Tahoma" w:cs="Tahoma"/>
-          <w:szCs w:val="21"/>
-        </w:rPr>
-        <w:t>、</w:t>
-      </w:r>
-      <w:r>
-        <w:rPr>
-          <w:rFonts w:ascii="Tahoma" w:hAnsi="Tahoma" w:cs="Tahoma"/>
-          <w:szCs w:val="21"/>
-        </w:rPr>
-        <w:t>Agent tool calling</w:t>
-      </w:r>
-      <w:r>
-        <w:rPr>
-          <w:rFonts w:ascii="Tahoma" w:hAnsi="Tahoma" w:cs="Tahoma"/>
-          <w:szCs w:val="21"/>
-        </w:rPr>
-        <w:t>、</w:t>
-      </w:r>
-      <w:r>
-        <w:rPr>
-          <w:rFonts w:ascii="Tahoma" w:hAnsi="Tahoma" w:cs="Tahoma"/>
-          <w:szCs w:val="21"/>
-        </w:rPr>
-        <w:t xml:space="preserve">prompt engineering </w:t>
-      </w:r>
-      <w:r>
-        <w:rPr>
-          <w:rFonts w:ascii="Tahoma" w:hAnsi="Tahoma" w:cs="Tahoma"/>
-          <w:szCs w:val="21"/>
-        </w:rPr>
-        <w:t>和</w:t>
-      </w:r>
-      <w:r>
-        <w:rPr>
-          <w:rFonts w:ascii="Tahoma" w:hAnsi="Tahoma" w:cs="Tahoma"/>
-          <w:szCs w:val="21"/>
-        </w:rPr>
-        <w:t xml:space="preserve"> Markdown </w:t>
-      </w:r>
-      <w:r>
-        <w:rPr>
-          <w:rFonts w:ascii="Tahoma" w:hAnsi="Tahoma" w:cs="Tahoma"/>
-          <w:szCs w:val="21"/>
-        </w:rPr>
-        <w:t>报告生成等</w:t>
-      </w:r>
-      <w:r>
-        <w:rPr>
-          <w:rFonts w:ascii="Tahoma" w:hAnsi="Tahoma" w:cs="Tahoma"/>
-          <w:szCs w:val="21"/>
-        </w:rPr>
-        <w:t xml:space="preserve"> AI </w:t>
-      </w:r>
-      <w:r>
-        <w:rPr>
-          <w:rFonts w:ascii="Tahoma" w:hAnsi="Tahoma" w:cs="Tahoma"/>
-          <w:szCs w:val="21"/>
-        </w:rPr>
-        <w:t>应用开发流程。</w:t>
-      </w:r>
-    </w:p>
-    <w:p>
-      <w:pPr>
-        <w:rPr>
-          <w:rFonts w:ascii="Tahoma" w:hAnsi="Tahoma" w:cs="Tahoma"/>
-          <w:b/>
-          <w:bCs/>
-          <w:szCs w:val="21"/>
-        </w:rPr>
-      </w:pPr>
-      <w:r>
-        <w:rPr>
-          <w:rFonts w:ascii="Tahoma" w:hAnsi="Tahoma" w:cs="Tahoma"/>
-          <w:b/>
-          <w:bCs/>
-          <w:szCs w:val="21"/>
-        </w:rPr>
-        <w:t>后端与工程工具：</w:t>
-      </w:r>
-      <w:r>
-        <w:rPr>
-          <w:rFonts w:ascii="Tahoma" w:hAnsi="Tahoma" w:cs="Tahoma"/>
-          <w:szCs w:val="21"/>
-        </w:rPr>
-        <w:t xml:space="preserve"> </w:t>
-      </w:r>
-      <w:r>
-        <w:rPr>
-          <w:rFonts w:ascii="Tahoma" w:hAnsi="Tahoma" w:cs="Tahoma"/>
-          <w:szCs w:val="21"/>
-        </w:rPr>
-        <w:t>了解</w:t>
-      </w:r>
-      <w:r>
-        <w:rPr>
-          <w:rFonts w:ascii="Tahoma" w:hAnsi="Tahoma" w:cs="Tahoma"/>
-          <w:szCs w:val="21"/>
-        </w:rPr>
-        <w:t xml:space="preserve"> FastAPI</w:t>
-      </w:r>
-      <w:r>
-        <w:rPr>
-          <w:rFonts w:ascii="Tahoma" w:hAnsi="Tahoma" w:cs="Tahoma"/>
-          <w:szCs w:val="21"/>
-        </w:rPr>
-        <w:t>、</w:t>
-      </w:r>
-      <w:r>
-        <w:rPr>
-          <w:rFonts w:ascii="Tahoma" w:hAnsi="Tahoma" w:cs="Tahoma"/>
-          <w:szCs w:val="21"/>
-        </w:rPr>
-        <w:t>MySQL / SQLite</w:t>
-      </w:r>
-      <w:r>
-        <w:rPr>
-          <w:rFonts w:ascii="Tahoma" w:hAnsi="Tahoma" w:cs="Tahoma"/>
-          <w:szCs w:val="21"/>
-        </w:rPr>
-        <w:t>、</w:t>
-      </w:r>
-      <w:r>
-        <w:rPr>
-          <w:rFonts w:ascii="Tahoma" w:hAnsi="Tahoma" w:cs="Tahoma"/>
-          <w:szCs w:val="21"/>
-        </w:rPr>
-        <w:t>Redis</w:t>
-      </w:r>
-      <w:r>
-        <w:rPr>
-          <w:rFonts w:ascii="Tahoma" w:hAnsi="Tahoma" w:cs="Tahoma"/>
-          <w:szCs w:val="21"/>
-        </w:rPr>
-        <w:t>、</w:t>
-      </w:r>
-      <w:r>
-        <w:rPr>
-          <w:rFonts w:ascii="Tahoma" w:hAnsi="Tahoma" w:cs="Tahoma"/>
-          <w:szCs w:val="21"/>
-        </w:rPr>
-        <w:t>REST API</w:t>
-      </w:r>
-      <w:r>
-        <w:rPr>
-          <w:rFonts w:ascii="Tahoma" w:hAnsi="Tahoma" w:cs="Tahoma"/>
-          <w:szCs w:val="21"/>
-        </w:rPr>
-        <w:t>、</w:t>
-      </w:r>
-      <w:r>
-        <w:rPr>
-          <w:rFonts w:ascii="Tahoma" w:hAnsi="Tahoma" w:cs="Tahoma"/>
-          <w:szCs w:val="21"/>
-        </w:rPr>
-        <w:t>HTTP</w:t>
-      </w:r>
-      <w:r>
-        <w:rPr>
-          <w:rFonts w:ascii="Tahoma" w:hAnsi="Tahoma" w:cs="Tahoma"/>
-          <w:szCs w:val="21"/>
-        </w:rPr>
-        <w:t>、</w:t>
-      </w:r>
-      <w:r>
-        <w:rPr>
-          <w:rFonts w:ascii="Tahoma" w:hAnsi="Tahoma" w:cs="Tahoma"/>
-          <w:szCs w:val="21"/>
-        </w:rPr>
-        <w:t>TCP</w:t>
-      </w:r>
-      <w:r>
-        <w:rPr>
-          <w:rFonts w:ascii="Tahoma" w:hAnsi="Tahoma" w:cs="Tahoma"/>
-          <w:szCs w:val="21"/>
-        </w:rPr>
-        <w:t>、</w:t>
-      </w:r>
-      <w:r>
-        <w:rPr>
-          <w:rFonts w:ascii="Tahoma" w:hAnsi="Tahoma" w:cs="Tahoma"/>
-          <w:szCs w:val="21"/>
-        </w:rPr>
-        <w:t xml:space="preserve">UDP </w:t>
-      </w:r>
-      <w:r>
-        <w:rPr>
-          <w:rFonts w:ascii="Tahoma" w:hAnsi="Tahoma" w:cs="Tahoma"/>
-          <w:szCs w:val="21"/>
-        </w:rPr>
-        <w:t>等后端与网络基础；理解索引、事务、锁、查询优化、缓存</w:t>
-      </w:r>
-      <w:r>
-        <w:rPr>
-          <w:rFonts w:ascii="Tahoma" w:hAnsi="Tahoma" w:cs="Tahoma"/>
-          <w:szCs w:val="21"/>
-        </w:rPr>
-        <w:t xml:space="preserve"> TTL</w:t>
-      </w:r>
-      <w:r>
-        <w:rPr>
-          <w:rFonts w:ascii="Tahoma" w:hAnsi="Tahoma" w:cs="Tahoma"/>
-          <w:szCs w:val="21"/>
-        </w:rPr>
-        <w:t>、缓存穿透、缓存击穿、日志追踪和</w:t>
-      </w:r>
-      <w:r>
-        <w:rPr>
-          <w:rFonts w:ascii="Tahoma" w:hAnsi="Tahoma" w:cs="Tahoma"/>
-          <w:szCs w:val="21"/>
-        </w:rPr>
-        <w:t xml:space="preserve"> TraceID </w:t>
-      </w:r>
-      <w:r>
-        <w:rPr>
-          <w:rFonts w:ascii="Tahoma" w:hAnsi="Tahoma" w:cs="Tahoma"/>
-          <w:szCs w:val="21"/>
-        </w:rPr>
-        <w:t>等工程概念；熟悉</w:t>
-      </w:r>
-      <w:r>
-        <w:rPr>
-          <w:rFonts w:ascii="Tahoma" w:hAnsi="Tahoma" w:cs="Tahoma"/>
-          <w:szCs w:val="21"/>
-        </w:rPr>
-        <w:t xml:space="preserve"> Linux</w:t>
-      </w:r>
-      <w:r>
-        <w:rPr>
-          <w:rFonts w:ascii="Tahoma" w:hAnsi="Tahoma" w:cs="Tahoma"/>
-          <w:szCs w:val="21"/>
-        </w:rPr>
-        <w:t>、</w:t>
-      </w:r>
-      <w:r>
-        <w:rPr>
-          <w:rFonts w:ascii="Tahoma" w:hAnsi="Tahoma" w:cs="Tahoma"/>
-          <w:szCs w:val="21"/>
-        </w:rPr>
-        <w:t>Bash</w:t>
-      </w:r>
-      <w:r>
-        <w:rPr>
-          <w:rFonts w:ascii="Tahoma" w:hAnsi="Tahoma" w:cs="Tahoma"/>
-          <w:szCs w:val="21"/>
-        </w:rPr>
-        <w:t>、</w:t>
-      </w:r>
-      <w:r>
-        <w:rPr>
-          <w:rFonts w:ascii="Tahoma" w:hAnsi="Tahoma" w:cs="Tahoma"/>
-          <w:szCs w:val="21"/>
-        </w:rPr>
-        <w:t>Git</w:t>
-      </w:r>
-      <w:r>
-        <w:rPr>
-          <w:rFonts w:ascii="Tahoma" w:hAnsi="Tahoma" w:cs="Tahoma"/>
-          <w:szCs w:val="21"/>
-        </w:rPr>
-        <w:t>、</w:t>
-      </w:r>
-      <w:r>
-        <w:rPr>
-          <w:rFonts w:ascii="Tahoma" w:hAnsi="Tahoma" w:cs="Tahoma"/>
-          <w:szCs w:val="21"/>
-        </w:rPr>
-        <w:t>VS Code</w:t>
-      </w:r>
-      <w:r>
-        <w:rPr>
-          <w:rFonts w:ascii="Tahoma" w:hAnsi="Tahoma" w:cs="Tahoma"/>
-          <w:szCs w:val="21"/>
-        </w:rPr>
-        <w:t>、</w:t>
-      </w:r>
-      <w:r>
-        <w:rPr>
-          <w:rFonts w:ascii="Tahoma" w:hAnsi="Tahoma" w:cs="Tahoma"/>
-          <w:szCs w:val="21"/>
-        </w:rPr>
-        <w:t xml:space="preserve">Docker </w:t>
-      </w:r>
-      <w:r>
-        <w:rPr>
-          <w:rFonts w:ascii="Tahoma" w:hAnsi="Tahoma" w:cs="Tahoma"/>
-          <w:szCs w:val="21"/>
-        </w:rPr>
-        <w:t>基础操作</w:t>
-      </w:r>
-      <w:r>
-        <w:rPr>
-          <w:rFonts w:ascii="Tahoma" w:hAnsi="Tahoma" w:cs="Tahoma"/>
-          <w:b/>
-          <w:bCs/>
-          <w:szCs w:val="21"/>
-        </w:rPr>
-        <w:t>。</w:t>
-      </w:r>
-    </w:p>
-    <w:p>
-      <w:pPr>
-        <w:rPr>
-          <w:rFonts w:ascii="Tahoma" w:hAnsi="Tahoma" w:cs="Tahoma"/>
-          <w:szCs w:val="21"/>
-        </w:rPr>
-      </w:pPr>
-      <w:r>
-        <w:rPr>
-          <w:rFonts w:ascii="Tahoma" w:hAnsi="Tahoma" w:cs="Tahoma"/>
-          <w:szCs w:val="21"/>
-        </w:rPr>
-        <w:pict w14:anchorId="6AE44A6D">
-          <v:rect id="_x0000_i1027" style="width:0;height:1.5pt" o:hralign="center" o:hrstd="t" o:hr="t" fillcolor="#a0a0a0" stroked="f"/>
-        </w:pict>
-      </w:r>
-    </w:p>
-    <w:p>
-      <w:pPr>
-        <w:rPr>
-          <w:rFonts w:ascii="Tahoma" w:hAnsi="Tahoma" w:cs="Tahoma"/>
-          <w:b/>
-          <w:bCs/>
-          <w:sz w:val="24"/>
-          <w:szCs w:val="24"/>
-        </w:rPr>
-      </w:pPr>
-      <w:r>
-        <w:rPr>
-          <w:rFonts w:ascii="Tahoma" w:hAnsi="Tahoma" w:cs="Tahoma"/>
-          <w:b/>
-          <w:bCs/>
-          <w:sz w:val="24"/>
-          <w:szCs w:val="24"/>
-        </w:rPr>
-        <w:t>项目经历</w:t>
-      </w:r>
-    </w:p>
-    <w:p>
-      <w:pPr>
-        <w:rPr>
-          <w:rFonts w:ascii="Tahoma" w:hAnsi="Tahoma" w:cs="Tahoma"/>
-          <w:b/>
-          <w:bCs/>
-          <w:sz w:val="22"/>
-        </w:rPr>
-      </w:pPr>
-      <w:r>
-        <w:rPr>
-          <w:rFonts w:ascii="Tahoma" w:hAnsi="Tahoma" w:cs="Tahoma"/>
-          <w:b/>
-          <w:bCs/>
-          <w:sz w:val="22"/>
-        </w:rPr>
-        <w:t>面向</w:t>
-      </w:r>
-      <w:r>
-        <w:rPr>
-          <w:rFonts w:ascii="Tahoma" w:hAnsi="Tahoma" w:cs="Tahoma"/>
-          <w:b/>
-          <w:bCs/>
-          <w:sz w:val="22"/>
-        </w:rPr>
-        <w:t xml:space="preserve"> PETSc </w:t>
       </w:r>
       <w:r>
         <w:rPr>
@@ -1455,7 +1524,23 @@
           <w:rFonts w:ascii="Tahoma" w:hAnsi="Tahoma" w:cs="Tahoma"/>
           <w:sz w:val="22"/>
         </w:rPr>
-        <w:t xml:space="preserve"> PETSc </w:t>
+        <w:t xml:space="preserve"> </w:t>
+      </w:r>
+      <w:proofErr w:type="spellStart"/>
+      <w:r>
+        <w:rPr>
+          <w:rFonts w:ascii="Tahoma" w:hAnsi="Tahoma" w:cs="Tahoma"/>
+          <w:sz w:val="22"/>
+        </w:rPr>
+        <w:t>PETSc</w:t>
+      </w:r>
+      <w:proofErr w:type="spellEnd"/>
+      <w:r>
+        <w:rPr>
+          <w:rFonts w:ascii="Tahoma" w:hAnsi="Tahoma" w:cs="Tahoma"/>
+          <w:sz w:val="22"/>
+        </w:rPr>
+        <w:t xml:space="preserve"> </w:t>
       </w:r>
       <w:r>
         <w:rPr>
@@ -1497,7 +1582,23 @@
           <w:rFonts w:ascii="Tahoma" w:hAnsi="Tahoma" w:cs="Tahoma"/>
           <w:sz w:val="22"/>
         </w:rPr>
-        <w:t xml:space="preserve"> hybrid MPI+OpenMP </w:t>
+        <w:t xml:space="preserve"> hybrid </w:t>
+      </w:r>
+      <w:proofErr w:type="spellStart"/>
+      <w:r>
+        <w:rPr>
+          <w:rFonts w:ascii="Tahoma" w:hAnsi="Tahoma" w:cs="Tahoma"/>
+          <w:sz w:val="22"/>
+        </w:rPr>
+        <w:t>MPI+OpenMP</w:t>
+      </w:r>
+      <w:proofErr w:type="spellEnd"/>
+      <w:r>
+        <w:rPr>
+          <w:rFonts w:ascii="Tahoma" w:hAnsi="Tahoma" w:cs="Tahoma"/>
+          <w:sz w:val="22"/>
+        </w:rPr>
+        <w:t xml:space="preserve"> </w:t>
       </w:r>
       <w:r>
         <w:rPr>
@@ -1513,19 +1614,44 @@
         </w:rPr>
         <w:t xml:space="preserve"> ARCHER2 </w:t>
       </w:r>
-      <w:r>
-        <w:rPr>
-          <w:rFonts w:ascii="Tahoma" w:hAnsi="Tahoma" w:cs="Tahoma"/>
-          <w:sz w:val="22"/>
-        </w:rPr>
-        <w:t>超算平台上完成大规模实验验证。项目覆盖</w:t>
-      </w:r>
-      <w:r>
-        <w:rPr>
-          <w:rFonts w:ascii="Tahoma" w:hAnsi="Tahoma" w:cs="Tahoma"/>
-          <w:sz w:val="22"/>
-        </w:rPr>
-        <w:t xml:space="preserve"> Slurm </w:t>
+      <w:proofErr w:type="gramStart"/>
+      <w:r>
+        <w:rPr>
+          <w:rFonts w:ascii="Tahoma" w:hAnsi="Tahoma" w:cs="Tahoma"/>
+          <w:sz w:val="22"/>
+        </w:rPr>
+        <w:t>超算平台</w:t>
+      </w:r>
+      <w:proofErr w:type="gramEnd"/>
+      <w:r>
+        <w:rPr>
+          <w:rFonts w:ascii="Tahoma" w:hAnsi="Tahoma" w:cs="Tahoma"/>
+          <w:sz w:val="22"/>
+        </w:rPr>
+        <w:t>上完成大规模实验验证。项目覆盖</w:t>
+      </w:r>
+      <w:r>
+        <w:rPr>
+          <w:rFonts w:ascii="Tahoma" w:hAnsi="Tahoma" w:cs="Tahoma"/>
+          <w:sz w:val="22"/>
+        </w:rPr>
+        <w:t xml:space="preserve"> </w:t>
+      </w:r>
+      <w:proofErr w:type="spellStart"/>
+      <w:r>
+        <w:rPr>
+          <w:rFonts w:ascii="Tahoma" w:hAnsi="Tahoma" w:cs="Tahoma"/>
+          <w:sz w:val="22"/>
+        </w:rPr>
+        <w:t>Slurm</w:t>
+      </w:r>
+      <w:proofErr w:type="spellEnd"/>
+      <w:r>
+        <w:rPr>
+          <w:rFonts w:ascii="Tahoma" w:hAnsi="Tahoma" w:cs="Tahoma"/>
+          <w:sz w:val="22"/>
+        </w:rPr>
+        <w:t xml:space="preserve"> </w:t>
       </w:r>
       <w:r>
         <w:rPr>
@@ -1534,12 +1660,21 @@
         </w:rPr>
         <w:t>作业调度、</w:t>
       </w:r>
-      <w:r>
-        <w:rPr>
-          <w:rFonts w:ascii="Tahoma" w:hAnsi="Tahoma" w:cs="Tahoma"/>
-          <w:sz w:val="22"/>
-        </w:rPr>
-        <w:t xml:space="preserve">PETSc </w:t>
+      <w:proofErr w:type="spellStart"/>
+      <w:r>
+        <w:rPr>
+          <w:rFonts w:ascii="Tahoma" w:hAnsi="Tahoma" w:cs="Tahoma"/>
+          <w:sz w:val="22"/>
+        </w:rPr>
+        <w:t>PETSc</w:t>
+      </w:r>
+      <w:proofErr w:type="spellEnd"/>
+      <w:r>
+        <w:rPr>
+          <w:rFonts w:ascii="Tahoma" w:hAnsi="Tahoma" w:cs="Tahoma"/>
+          <w:sz w:val="22"/>
+        </w:rPr>
+        <w:t xml:space="preserve"> </w:t>
       </w:r>
       <w:r>
         <w:rPr>
@@ -1567,7 +1702,23 @@
           <w:rFonts w:ascii="Tahoma" w:hAnsi="Tahoma" w:cs="Tahoma"/>
           <w:sz w:val="22"/>
         </w:rPr>
-        <w:t xml:space="preserve"> Linaro MAP profiling </w:t>
+        <w:t xml:space="preserve"> </w:t>
+      </w:r>
+      <w:proofErr w:type="spellStart"/>
+      <w:r>
+        <w:rPr>
+          <w:rFonts w:ascii="Tahoma" w:hAnsi="Tahoma" w:cs="Tahoma"/>
+          <w:sz w:val="22"/>
+        </w:rPr>
+        <w:t>Linaro</w:t>
+      </w:r>
+      <w:proofErr w:type="spellEnd"/>
+      <w:r>
+        <w:rPr>
+          <w:rFonts w:ascii="Tahoma" w:hAnsi="Tahoma" w:cs="Tahoma"/>
+          <w:sz w:val="22"/>
+        </w:rPr>
+        <w:t xml:space="preserve"> MAP profiling </w:t>
       </w:r>
       <w:r>
         <w:rPr>
@@ -1621,7 +1772,27 @@
           <w:bCs/>
           <w:sz w:val="22"/>
         </w:rPr>
-        <w:t>技术栈：</w:t>
+        <w:t>技术</w:t>
+      </w:r>
+      <w:proofErr w:type="gramStart"/>
+      <w:r>
+        <w:rPr>
+          <w:rFonts w:ascii="Tahoma" w:hAnsi="Tahoma" w:cs="Tahoma"/>
+          <w:b/>
+          <w:bCs/>
+          <w:sz w:val="22"/>
+        </w:rPr>
+        <w:t>栈</w:t>
+      </w:r>
+      <w:proofErr w:type="gramEnd"/>
+      <w:r>
+        <w:rPr>
+          <w:rFonts w:ascii="Tahoma" w:hAnsi="Tahoma" w:cs="Tahoma"/>
+          <w:b/>
+          <w:bCs/>
+          <w:sz w:val="22"/>
+        </w:rPr>
+        <w:t>：</w:t>
       </w:r>
       <w:r>
         <w:rPr>
@@ -1659,6 +1830,7 @@
         </w:rPr>
         <w:t>、</w:t>
       </w:r>
+      <w:proofErr w:type="spellStart"/>
       <w:r>
         <w:rPr>
           <w:rFonts w:ascii="Tahoma" w:hAnsi="Tahoma" w:cs="Tahoma"/>
@@ -1668,6 +1840,7 @@
         </w:rPr>
         <w:t>PETSc</w:t>
       </w:r>
+      <w:proofErr w:type="spellEnd"/>
       <w:r>
         <w:rPr>
           <w:rFonts w:ascii="Tahoma" w:hAnsi="Tahoma" w:cs="Tahoma"/>
@@ -1713,6 +1886,7 @@
         </w:rPr>
         <w:t>、</w:t>
       </w:r>
+      <w:proofErr w:type="spellStart"/>
       <w:r>
         <w:rPr>
           <w:rFonts w:ascii="Tahoma" w:hAnsi="Tahoma" w:cs="Tahoma"/>
@@ -1722,6 +1896,7 @@
         </w:rPr>
         <w:t>Slurm</w:t>
       </w:r>
+      <w:proofErr w:type="spellEnd"/>
       <w:r>
         <w:rPr>
           <w:rFonts w:ascii="Tahoma" w:hAnsi="Tahoma" w:cs="Tahoma"/>
@@ -1839,14 +2014,25 @@
         </w:rPr>
         <w:t>、</w:t>
       </w:r>
-      <w:r>
-        <w:rPr>
-          <w:rFonts w:ascii="Tahoma" w:hAnsi="Tahoma" w:cs="Tahoma"/>
-          <w:b/>
-          <w:bCs/>
-          <w:sz w:val="22"/>
-        </w:rPr>
-        <w:t>Linaro MAP</w:t>
+      <w:proofErr w:type="spellStart"/>
+      <w:r>
+        <w:rPr>
+          <w:rFonts w:ascii="Tahoma" w:hAnsi="Tahoma" w:cs="Tahoma"/>
+          <w:b/>
+          <w:bCs/>
+          <w:sz w:val="22"/>
+        </w:rPr>
+        <w:t>Linaro</w:t>
+      </w:r>
+      <w:proofErr w:type="spellEnd"/>
+      <w:r>
+        <w:rPr>
+          <w:rFonts w:ascii="Tahoma" w:hAnsi="Tahoma" w:cs="Tahoma"/>
+          <w:b/>
+          <w:bCs/>
+          <w:sz w:val="22"/>
+        </w:rPr>
+        <w:t xml:space="preserve"> MAP</w:t>
       </w:r>
     </w:p>
     <w:p>
@@ -1881,38 +2067,91 @@
       </w:pPr>
       <w:r>
         <w:rPr>
-          <w:rFonts w:ascii="Tahoma" w:hAnsi="Tahoma" w:cs="Tahoma"/>
-          <w:sz w:val="22"/>
-        </w:rPr>
-        <w:t>构建</w:t>
-      </w:r>
-      <w:r>
-        <w:rPr>
-          <w:rFonts w:ascii="Tahoma" w:hAnsi="Tahoma" w:cs="Tahoma"/>
-          <w:sz w:val="22"/>
-        </w:rPr>
-        <w:t xml:space="preserve"> PETSc benchmark </w:t>
-      </w:r>
-      <w:r>
-        <w:rPr>
-          <w:rFonts w:ascii="Tahoma" w:hAnsi="Tahoma" w:cs="Tahoma"/>
-          <w:sz w:val="22"/>
-        </w:rPr>
-        <w:t>自动化实验流程，覆盖程序编译、参数配置、</w:t>
-      </w:r>
-      <w:r>
-        <w:rPr>
-          <w:rFonts w:ascii="Tahoma" w:hAnsi="Tahoma" w:cs="Tahoma"/>
-          <w:sz w:val="22"/>
-        </w:rPr>
-        <w:t xml:space="preserve">Slurm </w:t>
-      </w:r>
-      <w:r>
-        <w:rPr>
-          <w:rFonts w:ascii="Tahoma" w:hAnsi="Tahoma" w:cs="Tahoma"/>
-          <w:sz w:val="22"/>
-        </w:rPr>
-        <w:t>作业提交、运行日志收集、结果解析、指标计算与性能可视化，提升大规模实验的可复现性与可维护性。</w:t>
+          <w:rFonts w:ascii="宋体" w:eastAsia="宋体" w:hAnsi="宋体" w:cs="宋体" w:hint="eastAsia"/>
+          <w:sz w:val="22"/>
+        </w:rPr>
+        <w:t>围绕</w:t>
+      </w:r>
+      <w:r>
+        <w:rPr>
+          <w:rFonts w:ascii="Tahoma" w:hAnsi="Tahoma" w:cs="Tahoma"/>
+          <w:sz w:val="22"/>
+        </w:rPr>
+        <w:t xml:space="preserve"> </w:t>
+      </w:r>
+      <w:proofErr w:type="spellStart"/>
+      <w:r>
+        <w:rPr>
+          <w:rFonts w:ascii="Tahoma" w:hAnsi="Tahoma" w:cs="Tahoma"/>
+          <w:sz w:val="22"/>
+        </w:rPr>
+        <w:t>PETSc</w:t>
+      </w:r>
+      <w:proofErr w:type="spellEnd"/>
+      <w:r>
+        <w:rPr>
+          <w:rFonts w:ascii="Tahoma" w:hAnsi="Tahoma" w:cs="Tahoma"/>
+          <w:sz w:val="22"/>
+        </w:rPr>
+        <w:t xml:space="preserve"> KSP </w:t>
+      </w:r>
+      <w:r>
+        <w:rPr>
+          <w:rFonts w:ascii="宋体" w:eastAsia="宋体" w:hAnsi="宋体" w:cs="宋体" w:hint="eastAsia"/>
+          <w:sz w:val="22"/>
+        </w:rPr>
+        <w:t>线性求解器构建可复现</w:t>
+      </w:r>
+      <w:r>
+        <w:rPr>
+          <w:rFonts w:ascii="Tahoma" w:hAnsi="Tahoma" w:cs="Tahoma"/>
+          <w:sz w:val="22"/>
+        </w:rPr>
+        <w:t xml:space="preserve"> benchmark </w:t>
+      </w:r>
+      <w:r>
+        <w:rPr>
+          <w:rFonts w:ascii="宋体" w:eastAsia="宋体" w:hAnsi="宋体" w:cs="宋体" w:hint="eastAsia"/>
+          <w:sz w:val="22"/>
+        </w:rPr>
+        <w:t>流程，覆盖编译、参数生成、</w:t>
+      </w:r>
+      <w:proofErr w:type="spellStart"/>
+      <w:r>
+        <w:rPr>
+          <w:rFonts w:ascii="Tahoma" w:hAnsi="Tahoma" w:cs="Tahoma"/>
+          <w:sz w:val="22"/>
+        </w:rPr>
+        <w:t>Slurm</w:t>
+      </w:r>
+      <w:proofErr w:type="spellEnd"/>
+      <w:r>
+        <w:rPr>
+          <w:rFonts w:ascii="Tahoma" w:hAnsi="Tahoma" w:cs="Tahoma"/>
+          <w:sz w:val="22"/>
+        </w:rPr>
+        <w:t xml:space="preserve"> </w:t>
+      </w:r>
+      <w:r>
+        <w:rPr>
+          <w:rFonts w:ascii="宋体" w:eastAsia="宋体" w:hAnsi="宋体" w:cs="宋体" w:hint="eastAsia"/>
+          <w:sz w:val="22"/>
+        </w:rPr>
+        <w:t>提交、日志收集、结果解析、指标计算、可视化和</w:t>
+      </w:r>
+      <w:r>
+        <w:rPr>
+          <w:rFonts w:ascii="Tahoma" w:hAnsi="Tahoma" w:cs="Tahoma"/>
+          <w:sz w:val="22"/>
+        </w:rPr>
+        <w:t xml:space="preserve"> profiling </w:t>
+      </w:r>
+      <w:r>
+        <w:rPr>
+          <w:rFonts w:ascii="宋体" w:eastAsia="宋体" w:hAnsi="宋体" w:cs="宋体" w:hint="eastAsia"/>
+          <w:sz w:val="22"/>
+        </w:rPr>
+        <w:t>分析</w:t>
       </w:r>
     </w:p>
     <w:p>
@@ -1928,94 +2167,136 @@
       </w:pPr>
       <w:r>
         <w:rPr>
-          <w:rFonts w:ascii="Tahoma" w:hAnsi="Tahoma" w:cs="Tahoma"/>
-          <w:sz w:val="22"/>
-        </w:rPr>
-        <w:t>设计并编写</w:t>
-      </w:r>
-      <w:r>
-        <w:rPr>
-          <w:rFonts w:ascii="Tahoma" w:hAnsi="Tahoma" w:cs="Tahoma"/>
-          <w:sz w:val="22"/>
-        </w:rPr>
-        <w:t xml:space="preserve"> Slurm </w:t>
-      </w:r>
-      <w:r>
-        <w:rPr>
-          <w:rFonts w:ascii="Tahoma" w:hAnsi="Tahoma" w:cs="Tahoma"/>
-          <w:sz w:val="22"/>
-        </w:rPr>
-        <w:t>批处理脚本，支持不同</w:t>
-      </w:r>
-      <w:r>
-        <w:rPr>
-          <w:rFonts w:ascii="Tahoma" w:hAnsi="Tahoma" w:cs="Tahoma"/>
-          <w:sz w:val="22"/>
-        </w:rPr>
-        <w:t xml:space="preserve"> nodes</w:t>
-      </w:r>
-      <w:r>
-        <w:rPr>
-          <w:rFonts w:ascii="Tahoma" w:hAnsi="Tahoma" w:cs="Tahoma"/>
-          <w:sz w:val="22"/>
-        </w:rPr>
-        <w:t>、</w:t>
-      </w:r>
-      <w:r>
-        <w:rPr>
-          <w:rFonts w:ascii="Tahoma" w:hAnsi="Tahoma" w:cs="Tahoma"/>
-          <w:sz w:val="22"/>
-        </w:rPr>
-        <w:t>MPI ranks</w:t>
-      </w:r>
-      <w:r>
-        <w:rPr>
-          <w:rFonts w:ascii="Tahoma" w:hAnsi="Tahoma" w:cs="Tahoma"/>
-          <w:sz w:val="22"/>
-        </w:rPr>
-        <w:t>、</w:t>
-      </w:r>
-      <w:r>
-        <w:rPr>
-          <w:rFonts w:ascii="Tahoma" w:hAnsi="Tahoma" w:cs="Tahoma"/>
-          <w:sz w:val="22"/>
-        </w:rPr>
-        <w:t xml:space="preserve">OpenMP threads </w:t>
-      </w:r>
-      <w:r>
-        <w:rPr>
-          <w:rFonts w:ascii="Tahoma" w:hAnsi="Tahoma" w:cs="Tahoma"/>
-          <w:sz w:val="22"/>
-        </w:rPr>
-        <w:t>组合下的</w:t>
-      </w:r>
-      <w:r>
-        <w:rPr>
-          <w:rFonts w:ascii="Tahoma" w:hAnsi="Tahoma" w:cs="Tahoma"/>
-          <w:sz w:val="22"/>
-        </w:rPr>
-        <w:t xml:space="preserve"> MPI-only </w:t>
-      </w:r>
-      <w:r>
-        <w:rPr>
-          <w:rFonts w:ascii="Tahoma" w:hAnsi="Tahoma" w:cs="Tahoma"/>
-          <w:sz w:val="22"/>
-        </w:rPr>
-        <w:t>与</w:t>
-      </w:r>
-      <w:r>
-        <w:rPr>
-          <w:rFonts w:ascii="Tahoma" w:hAnsi="Tahoma" w:cs="Tahoma"/>
-          <w:sz w:val="22"/>
-        </w:rPr>
-        <w:t xml:space="preserve"> hybrid MPI+OpenMP </w:t>
-      </w:r>
-      <w:r>
-        <w:rPr>
-          <w:rFonts w:ascii="Tahoma" w:hAnsi="Tahoma" w:cs="Tahoma"/>
-          <w:sz w:val="22"/>
-        </w:rPr>
-        <w:t>实验，用于分析并行配置对求解性能的影响。</w:t>
+          <w:rFonts w:ascii="宋体" w:eastAsia="宋体" w:hAnsi="宋体" w:cs="宋体" w:hint="eastAsia"/>
+          <w:sz w:val="22"/>
+        </w:rPr>
+        <w:t>在</w:t>
+      </w:r>
+      <w:r>
+        <w:rPr>
+          <w:rFonts w:ascii="Tahoma" w:hAnsi="Tahoma" w:cs="Tahoma"/>
+          <w:sz w:val="22"/>
+        </w:rPr>
+        <w:t xml:space="preserve"> ARCHER2 </w:t>
+      </w:r>
+      <w:r>
+        <w:rPr>
+          <w:rFonts w:ascii="宋体" w:eastAsia="宋体" w:hAnsi="宋体" w:cs="宋体" w:hint="eastAsia"/>
+          <w:sz w:val="22"/>
+        </w:rPr>
+        <w:t>上完成</w:t>
+      </w:r>
+      <w:r>
+        <w:rPr>
+          <w:rFonts w:ascii="Tahoma" w:hAnsi="Tahoma" w:cs="Tahoma"/>
+          <w:sz w:val="22"/>
+        </w:rPr>
+        <w:t xml:space="preserve"> 2D / 3D stencil </w:t>
+      </w:r>
+      <w:r>
+        <w:rPr>
+          <w:rFonts w:ascii="宋体" w:eastAsia="宋体" w:hAnsi="宋体" w:cs="宋体" w:hint="eastAsia"/>
+          <w:sz w:val="22"/>
+        </w:rPr>
+        <w:t>基准实验，当前覆盖约</w:t>
+      </w:r>
+      <w:r>
+        <w:rPr>
+          <w:rFonts w:ascii="Tahoma" w:hAnsi="Tahoma" w:cs="Tahoma"/>
+          <w:sz w:val="22"/>
+        </w:rPr>
+        <w:t xml:space="preserve"> 1.00M</w:t>
+      </w:r>
+      <w:r>
+        <w:rPr>
+          <w:rFonts w:ascii="宋体" w:eastAsia="宋体" w:hAnsi="宋体" w:cs="宋体" w:hint="eastAsia"/>
+          <w:sz w:val="22"/>
+        </w:rPr>
+        <w:t>、</w:t>
+      </w:r>
+      <w:r>
+        <w:rPr>
+          <w:rFonts w:ascii="Tahoma" w:hAnsi="Tahoma" w:cs="Tahoma"/>
+          <w:sz w:val="22"/>
+        </w:rPr>
+        <w:t>5.02M</w:t>
+      </w:r>
+      <w:r>
+        <w:rPr>
+          <w:rFonts w:ascii="宋体" w:eastAsia="宋体" w:hAnsi="宋体" w:cs="宋体" w:hint="eastAsia"/>
+          <w:sz w:val="22"/>
+        </w:rPr>
+        <w:t>、</w:t>
+      </w:r>
+      <w:r>
+        <w:rPr>
+          <w:rFonts w:ascii="Tahoma" w:hAnsi="Tahoma" w:cs="Tahoma"/>
+          <w:sz w:val="22"/>
+        </w:rPr>
+        <w:t>9.99M</w:t>
+      </w:r>
+      <w:r>
+        <w:rPr>
+          <w:rFonts w:ascii="宋体" w:eastAsia="宋体" w:hAnsi="宋体" w:cs="宋体" w:hint="eastAsia"/>
+          <w:sz w:val="22"/>
+        </w:rPr>
+        <w:t>、</w:t>
+      </w:r>
+      <w:r>
+        <w:rPr>
+          <w:rFonts w:ascii="Tahoma" w:hAnsi="Tahoma" w:cs="Tahoma"/>
+          <w:sz w:val="22"/>
+        </w:rPr>
+        <w:t>20.25M</w:t>
+      </w:r>
+      <w:r>
+        <w:rPr>
+          <w:rFonts w:ascii="宋体" w:eastAsia="宋体" w:hAnsi="宋体" w:cs="宋体" w:hint="eastAsia"/>
+          <w:sz w:val="22"/>
+        </w:rPr>
+        <w:t>、</w:t>
+      </w:r>
+      <w:r>
+        <w:rPr>
+          <w:rFonts w:ascii="Tahoma" w:hAnsi="Tahoma" w:cs="Tahoma"/>
+          <w:sz w:val="22"/>
+        </w:rPr>
+        <w:t>40.96M unknowns</w:t>
+      </w:r>
+      <w:r>
+        <w:rPr>
+          <w:rFonts w:ascii="宋体" w:eastAsia="宋体" w:hAnsi="宋体" w:cs="宋体" w:hint="eastAsia"/>
+          <w:sz w:val="22"/>
+        </w:rPr>
+        <w:t>；最大已完成规模为</w:t>
+      </w:r>
+      <w:r>
+        <w:rPr>
+          <w:rFonts w:ascii="Tahoma" w:hAnsi="Tahoma" w:cs="Tahoma"/>
+          <w:sz w:val="22"/>
+        </w:rPr>
+        <w:t xml:space="preserve"> 40,960,000 unknowns</w:t>
+      </w:r>
+      <w:r>
+        <w:rPr>
+          <w:rFonts w:ascii="宋体" w:eastAsia="宋体" w:hAnsi="宋体" w:cs="宋体" w:hint="eastAsia"/>
+          <w:sz w:val="22"/>
+        </w:rPr>
+        <w:t>，实验核心数覆盖至</w:t>
+      </w:r>
+      <w:r>
+        <w:rPr>
+          <w:rFonts w:ascii="Tahoma" w:hAnsi="Tahoma" w:cs="Tahoma"/>
+          <w:sz w:val="22"/>
+        </w:rPr>
+        <w:t xml:space="preserve"> 128 cores</w:t>
+      </w:r>
+      <w:r>
+        <w:rPr>
+          <w:rFonts w:ascii="宋体" w:eastAsia="宋体" w:hAnsi="宋体" w:cs="宋体" w:hint="eastAsia"/>
+          <w:sz w:val="22"/>
+        </w:rPr>
+        <w:t>.</w:t>
       </w:r>
     </w:p>
     <w:p>
@@ -2031,115 +2312,103 @@
       </w:pPr>
       <w:r>
         <w:rPr>
-          <w:rFonts w:ascii="Tahoma" w:hAnsi="Tahoma" w:cs="Tahoma"/>
-          <w:sz w:val="22"/>
-        </w:rPr>
-        <w:t>在</w:t>
-      </w:r>
-      <w:r>
-        <w:rPr>
-          <w:rFonts w:ascii="Tahoma" w:hAnsi="Tahoma" w:cs="Tahoma"/>
-          <w:sz w:val="22"/>
-        </w:rPr>
-        <w:t xml:space="preserve"> ARCHER2 </w:t>
-      </w:r>
-      <w:r>
-        <w:rPr>
-          <w:rFonts w:ascii="Tahoma" w:hAnsi="Tahoma" w:cs="Tahoma"/>
-          <w:sz w:val="22"/>
-        </w:rPr>
-        <w:t>超算平台上完成</w:t>
-      </w:r>
-      <w:r>
-        <w:rPr>
-          <w:rFonts w:ascii="Tahoma" w:hAnsi="Tahoma" w:cs="Tahoma"/>
-          <w:sz w:val="22"/>
-        </w:rPr>
-        <w:t xml:space="preserve"> PETSc </w:t>
-      </w:r>
-      <w:r>
-        <w:rPr>
-          <w:rFonts w:ascii="Tahoma" w:hAnsi="Tahoma" w:cs="Tahoma"/>
-          <w:sz w:val="22"/>
-        </w:rPr>
-        <w:t>线性求解器性能测试，覆盖</w:t>
-      </w:r>
-      <w:r>
-        <w:rPr>
-          <w:rFonts w:ascii="Tahoma" w:hAnsi="Tahoma" w:cs="Tahoma"/>
-          <w:sz w:val="22"/>
-        </w:rPr>
-        <w:t xml:space="preserve"> 2D / 3D stencil </w:t>
-      </w:r>
-      <w:r>
-        <w:rPr>
-          <w:rFonts w:ascii="Tahoma" w:hAnsi="Tahoma" w:cs="Tahoma"/>
-          <w:sz w:val="22"/>
-        </w:rPr>
-        <w:t>等基准问题，最大问题规模达</w:t>
-      </w:r>
-      <w:r>
-        <w:rPr>
-          <w:rFonts w:ascii="Tahoma" w:hAnsi="Tahoma" w:cs="Tahoma"/>
-          <w:sz w:val="22"/>
-        </w:rPr>
-        <w:t xml:space="preserve"> 40,960,000 unknowns</w:t>
-      </w:r>
-      <w:r>
-        <w:rPr>
-          <w:rFonts w:ascii="Tahoma" w:hAnsi="Tahoma" w:cs="Tahoma"/>
-          <w:sz w:val="22"/>
-        </w:rPr>
-        <w:t>，最高使用</w:t>
-      </w:r>
-      <w:r>
-        <w:rPr>
-          <w:rFonts w:ascii="Tahoma" w:hAnsi="Tahoma" w:cs="Tahoma"/>
-          <w:sz w:val="22"/>
-        </w:rPr>
-        <w:t xml:space="preserve"> </w:t>
-      </w:r>
-      <w:r>
-        <w:rPr>
-          <w:rFonts w:ascii="Tahoma" w:hAnsi="Tahoma" w:cs="Tahoma" w:hint="eastAsia"/>
-          <w:sz w:val="22"/>
-        </w:rPr>
-        <w:t xml:space="preserve">64 nodes, </w:t>
-      </w:r>
-      <w:r>
-        <w:rPr>
-          <w:rFonts w:ascii="Tahoma" w:hAnsi="Tahoma" w:cs="Tahoma" w:hint="eastAsia"/>
-          <w:sz w:val="22"/>
-        </w:rPr>
-        <w:t>覆盖至多</w:t>
-      </w:r>
-      <w:r>
-        <w:rPr>
-          <w:rFonts w:ascii="Tahoma" w:hAnsi="Tahoma" w:cs="Tahoma" w:hint="eastAsia"/>
-          <w:sz w:val="22"/>
-        </w:rPr>
-        <w:t xml:space="preserve">128 cores </w:t>
-      </w:r>
-      <w:r>
-        <w:rPr>
-          <w:rFonts w:ascii="Tahoma" w:hAnsi="Tahoma" w:cs="Tahoma" w:hint="eastAsia"/>
-          <w:sz w:val="22"/>
-        </w:rPr>
-        <w:t>每个</w:t>
-      </w:r>
-      <w:r>
-        <w:rPr>
-          <w:rFonts w:ascii="Tahoma" w:hAnsi="Tahoma" w:cs="Tahoma" w:hint="eastAsia"/>
-          <w:sz w:val="22"/>
-        </w:rPr>
-        <w:t xml:space="preserve"> node</w:t>
-      </w:r>
-      <w:r>
-        <w:rPr>
-          <w:rFonts w:ascii="Tahoma" w:hAnsi="Tahoma" w:cs="Tahoma"/>
-          <w:sz w:val="22"/>
-        </w:rPr>
-        <w:t>。</w:t>
+          <w:rFonts w:ascii="宋体" w:eastAsia="宋体" w:hAnsi="宋体" w:cs="宋体" w:hint="eastAsia"/>
+          <w:sz w:val="22"/>
+        </w:rPr>
+        <w:t>设计</w:t>
+      </w:r>
+      <w:r>
+        <w:rPr>
+          <w:rFonts w:ascii="Tahoma" w:hAnsi="Tahoma" w:cs="Tahoma"/>
+          <w:sz w:val="22"/>
+        </w:rPr>
+        <w:t xml:space="preserve"> nodes</w:t>
+      </w:r>
+      <w:r>
+        <w:rPr>
+          <w:rFonts w:ascii="宋体" w:eastAsia="宋体" w:hAnsi="宋体" w:cs="宋体" w:hint="eastAsia"/>
+          <w:sz w:val="22"/>
+        </w:rPr>
+        <w:t>、</w:t>
+      </w:r>
+      <w:r>
+        <w:rPr>
+          <w:rFonts w:ascii="Tahoma" w:hAnsi="Tahoma" w:cs="Tahoma"/>
+          <w:sz w:val="22"/>
+        </w:rPr>
+        <w:t>MPI ranks</w:t>
+      </w:r>
+      <w:r>
+        <w:rPr>
+          <w:rFonts w:ascii="宋体" w:eastAsia="宋体" w:hAnsi="宋体" w:cs="宋体" w:hint="eastAsia"/>
+          <w:sz w:val="22"/>
+        </w:rPr>
+        <w:t>、</w:t>
+      </w:r>
+      <w:r>
+        <w:rPr>
+          <w:rFonts w:ascii="Tahoma" w:hAnsi="Tahoma" w:cs="Tahoma"/>
+          <w:sz w:val="22"/>
+        </w:rPr>
+        <w:t xml:space="preserve">OpenMP threads </w:t>
+      </w:r>
+      <w:r>
+        <w:rPr>
+          <w:rFonts w:ascii="宋体" w:eastAsia="宋体" w:hAnsi="宋体" w:cs="宋体" w:hint="eastAsia"/>
+          <w:sz w:val="22"/>
+        </w:rPr>
+        <w:t>组合实验，对比</w:t>
+      </w:r>
+      <w:r>
+        <w:rPr>
+          <w:rFonts w:ascii="Tahoma" w:hAnsi="Tahoma" w:cs="Tahoma"/>
+          <w:sz w:val="22"/>
+        </w:rPr>
+        <w:t xml:space="preserve"> MPI-only </w:t>
+      </w:r>
+      <w:r>
+        <w:rPr>
+          <w:rFonts w:ascii="宋体" w:eastAsia="宋体" w:hAnsi="宋体" w:cs="宋体" w:hint="eastAsia"/>
+          <w:sz w:val="22"/>
+        </w:rPr>
+        <w:t>与</w:t>
+      </w:r>
+      <w:r>
+        <w:rPr>
+          <w:rFonts w:ascii="Tahoma" w:hAnsi="Tahoma" w:cs="Tahoma"/>
+          <w:sz w:val="22"/>
+        </w:rPr>
+        <w:t xml:space="preserve"> hybrid </w:t>
+      </w:r>
+      <w:proofErr w:type="spellStart"/>
+      <w:r>
+        <w:rPr>
+          <w:rFonts w:ascii="Tahoma" w:hAnsi="Tahoma" w:cs="Tahoma"/>
+          <w:sz w:val="22"/>
+        </w:rPr>
+        <w:t>MPI+OpenMP</w:t>
+      </w:r>
+      <w:proofErr w:type="spellEnd"/>
+      <w:r>
+        <w:rPr>
+          <w:rFonts w:ascii="宋体" w:eastAsia="宋体" w:hAnsi="宋体" w:cs="宋体" w:hint="eastAsia"/>
+          <w:sz w:val="22"/>
+        </w:rPr>
+        <w:t>，并保留</w:t>
+      </w:r>
+      <w:r>
+        <w:rPr>
+          <w:rFonts w:ascii="Tahoma" w:hAnsi="Tahoma" w:cs="Tahoma"/>
+          <w:sz w:val="22"/>
+        </w:rPr>
+        <w:t xml:space="preserve"> ranks / threads / total cores / KSP iterations / solver status / error logs </w:t>
+      </w:r>
+      <w:r>
+        <w:rPr>
+          <w:rFonts w:ascii="宋体" w:eastAsia="宋体" w:hAnsi="宋体" w:cs="宋体" w:hint="eastAsia"/>
+          <w:sz w:val="22"/>
+        </w:rPr>
+        <w:t>等字段用于复盘</w:t>
       </w:r>
     </w:p>
     <w:p>
@@ -2172,7 +2441,60 @@
           <w:rFonts w:ascii="Tahoma" w:hAnsi="Tahoma" w:cs="Tahoma"/>
           <w:sz w:val="22"/>
         </w:rPr>
-        <w:t>编写日志解析与数据清洗脚本，从原始运行输出中提取</w:t>
+        <w:t>编写日志解析与数据清洗脚本，从</w:t>
+      </w:r>
+      <w:r>
+        <w:rPr>
+          <w:rFonts w:ascii="宋体" w:eastAsia="宋体" w:hAnsi="宋体" w:cs="宋体" w:hint="eastAsia"/>
+          <w:sz w:val="22"/>
+        </w:rPr>
+        <w:t>原始</w:t>
+      </w:r>
+      <w:r>
+        <w:rPr>
+          <w:rFonts w:ascii="Tahoma" w:hAnsi="Tahoma" w:cs="Tahoma"/>
+          <w:sz w:val="22"/>
+        </w:rPr>
+        <w:t xml:space="preserve"> </w:t>
+      </w:r>
+      <w:proofErr w:type="spellStart"/>
+      <w:r>
+        <w:rPr>
+          <w:rFonts w:ascii="Tahoma" w:hAnsi="Tahoma" w:cs="Tahoma"/>
+          <w:sz w:val="22"/>
+        </w:rPr>
+        <w:t>Slurm</w:t>
+      </w:r>
+      <w:proofErr w:type="spellEnd"/>
+      <w:r>
+        <w:rPr>
+          <w:rFonts w:ascii="Tahoma" w:hAnsi="Tahoma" w:cs="Tahoma"/>
+          <w:sz w:val="22"/>
+        </w:rPr>
+        <w:t xml:space="preserve"> / </w:t>
+      </w:r>
+      <w:proofErr w:type="spellStart"/>
+      <w:r>
+        <w:rPr>
+          <w:rFonts w:ascii="Tahoma" w:hAnsi="Tahoma" w:cs="Tahoma"/>
+          <w:sz w:val="22"/>
+        </w:rPr>
+        <w:t>PETSc</w:t>
+      </w:r>
+      <w:proofErr w:type="spellEnd"/>
+      <w:r>
+        <w:rPr>
+          <w:rFonts w:ascii="Tahoma" w:hAnsi="Tahoma" w:cs="Tahoma"/>
+          <w:sz w:val="22"/>
+        </w:rPr>
+        <w:t xml:space="preserve"> </w:t>
+      </w:r>
+      <w:r>
+        <w:rPr>
+          <w:rFonts w:ascii="Tahoma" w:hAnsi="Tahoma" w:cs="Tahoma"/>
+          <w:sz w:val="22"/>
+        </w:rPr>
+        <w:t>运行输出中提取</w:t>
       </w:r>
       <w:r>
         <w:rPr>
@@ -2378,6 +2700,43 @@
           <w:rFonts w:ascii="Tahoma" w:hAnsi="Tahoma" w:cs="Tahoma"/>
           <w:sz w:val="22"/>
         </w:rPr>
+        <w:t>使用</w:t>
+      </w:r>
+      <w:r>
+        <w:rPr>
+          <w:rFonts w:ascii="Tahoma" w:hAnsi="Tahoma" w:cs="Tahoma"/>
+          <w:sz w:val="22"/>
+        </w:rPr>
+        <w:t xml:space="preserve"> </w:t>
+      </w:r>
+      <w:proofErr w:type="spellStart"/>
+      <w:r>
+        <w:rPr>
+          <w:rFonts w:ascii="Tahoma" w:hAnsi="Tahoma" w:cs="Tahoma"/>
+          <w:sz w:val="22"/>
+        </w:rPr>
+        <w:t>Linaro</w:t>
+      </w:r>
+      <w:proofErr w:type="spellEnd"/>
+      <w:r>
+        <w:rPr>
+          <w:rFonts w:ascii="Tahoma" w:hAnsi="Tahoma" w:cs="Tahoma"/>
+          <w:sz w:val="22"/>
+        </w:rPr>
+        <w:t xml:space="preserve"> MAP </w:t>
+      </w:r>
+      <w:r>
+        <w:rPr>
+          <w:rFonts w:ascii="Tahoma" w:hAnsi="Tahoma" w:cs="Tahoma"/>
+          <w:sz w:val="22"/>
+        </w:rPr>
+        <w:t>辅助分析程序运行过程中的性能瓶颈，</w:t>
+      </w:r>
+      <w:r>
+        <w:rPr>
+          <w:rFonts w:ascii="Tahoma" w:hAnsi="Tahoma" w:cs="Tahoma"/>
+          <w:sz w:val="22"/>
+        </w:rPr>
         <w:t>对比</w:t>
       </w:r>
       <w:r>
@@ -2399,28 +2758,58 @@
           <w:rFonts w:ascii="Tahoma" w:hAnsi="Tahoma" w:cs="Tahoma"/>
           <w:sz w:val="22"/>
         </w:rPr>
-        <w:t xml:space="preserve"> hybrid MPI+OpenMP </w:t>
-      </w:r>
-      <w:r>
-        <w:rPr>
-          <w:rFonts w:ascii="Tahoma" w:hAnsi="Tahoma" w:cs="Tahoma"/>
-          <w:sz w:val="22"/>
-        </w:rPr>
-        <w:t>执行模式，分析不同配置下的性能变化，并从</w:t>
-      </w:r>
-      <w:r>
-        <w:rPr>
-          <w:rFonts w:ascii="Tahoma" w:hAnsi="Tahoma" w:cs="Tahoma"/>
-          <w:sz w:val="22"/>
-        </w:rPr>
-        <w:t xml:space="preserve"> MPI </w:t>
-      </w:r>
-      <w:r>
-        <w:rPr>
-          <w:rFonts w:ascii="Tahoma" w:hAnsi="Tahoma" w:cs="Tahoma"/>
-          <w:sz w:val="22"/>
-        </w:rPr>
-        <w:t>通信开销、</w:t>
+        <w:t xml:space="preserve"> hybrid </w:t>
+      </w:r>
+      <w:proofErr w:type="spellStart"/>
+      <w:r>
+        <w:rPr>
+          <w:rFonts w:ascii="Tahoma" w:hAnsi="Tahoma" w:cs="Tahoma"/>
+          <w:sz w:val="22"/>
+        </w:rPr>
+        <w:t>MPI+OpenMP</w:t>
+      </w:r>
+      <w:proofErr w:type="spellEnd"/>
+      <w:r>
+        <w:rPr>
+          <w:rFonts w:ascii="Tahoma" w:hAnsi="Tahoma" w:cs="Tahoma"/>
+          <w:sz w:val="22"/>
+        </w:rPr>
+        <w:t xml:space="preserve"> </w:t>
+      </w:r>
+      <w:r>
+        <w:rPr>
+          <w:rFonts w:ascii="Tahoma" w:hAnsi="Tahoma" w:cs="Tahoma"/>
+          <w:sz w:val="22"/>
+        </w:rPr>
+        <w:t>执行模式</w:t>
+      </w:r>
+      <w:r>
+        <w:rPr>
+          <w:rFonts w:ascii="Tahoma" w:hAnsi="Tahoma" w:cs="Tahoma" w:hint="eastAsia"/>
+          <w:sz w:val="22"/>
+        </w:rPr>
+        <w:t>,</w:t>
+      </w:r>
+      <w:r>
+        <w:rPr>
+          <w:rFonts w:ascii="Tahoma" w:hAnsi="Tahoma" w:cs="Tahoma"/>
+          <w:sz w:val="22"/>
+        </w:rPr>
+        <w:t>观察计算时间、</w:t>
+      </w:r>
+      <w:r>
+        <w:rPr>
+          <w:rFonts w:ascii="Tahoma" w:hAnsi="Tahoma" w:cs="Tahoma"/>
+          <w:sz w:val="22"/>
+        </w:rPr>
+        <w:t xml:space="preserve">MPI </w:t>
+      </w:r>
+      <w:r>
+        <w:rPr>
+          <w:rFonts w:ascii="Tahoma" w:hAnsi="Tahoma" w:cs="Tahoma"/>
+          <w:sz w:val="22"/>
+        </w:rPr>
+        <w:t>通信时间、</w:t>
       </w:r>
       <w:r>
         <w:rPr>
@@ -2434,7 +2823,21 @@
           <w:rFonts w:ascii="Tahoma" w:hAnsi="Tahoma" w:cs="Tahoma"/>
           <w:sz w:val="22"/>
         </w:rPr>
-        <w:t>线程调度开销、同步开销、负载均衡和内存访问局部性角度解释性能差异。</w:t>
+        <w:t>占比、线程利用率和潜在负载不均衡问题，评估</w:t>
+      </w:r>
+      <w:r>
+        <w:rPr>
+          <w:rFonts w:ascii="Tahoma" w:hAnsi="Tahoma" w:cs="Tahoma"/>
+          <w:sz w:val="22"/>
+        </w:rPr>
+        <w:t xml:space="preserve"> hybrid execution </w:t>
+      </w:r>
+      <w:r>
+        <w:rPr>
+          <w:rFonts w:ascii="Tahoma" w:hAnsi="Tahoma" w:cs="Tahoma"/>
+          <w:sz w:val="22"/>
+        </w:rPr>
+        <w:t>在不同问题规模下的适用场景。</w:t>
       </w:r>
     </w:p>
     <w:p>
@@ -2453,63 +2856,107 @@
           <w:rFonts w:ascii="Tahoma" w:hAnsi="Tahoma" w:cs="Tahoma"/>
           <w:sz w:val="22"/>
         </w:rPr>
-        <w:t>使用</w:t>
-      </w:r>
-      <w:r>
-        <w:rPr>
-          <w:rFonts w:ascii="Tahoma" w:hAnsi="Tahoma" w:cs="Tahoma"/>
-          <w:sz w:val="22"/>
-        </w:rPr>
-        <w:t xml:space="preserve"> Linaro MAP </w:t>
-      </w:r>
-      <w:r>
-        <w:rPr>
-          <w:rFonts w:ascii="Tahoma" w:hAnsi="Tahoma" w:cs="Tahoma"/>
-          <w:sz w:val="22"/>
-        </w:rPr>
-        <w:t>辅助分析程序运行过程中的性能瓶颈，观察计算时间、</w:t>
-      </w:r>
-      <w:r>
-        <w:rPr>
-          <w:rFonts w:ascii="Tahoma" w:hAnsi="Tahoma" w:cs="Tahoma"/>
-          <w:sz w:val="22"/>
-        </w:rPr>
-        <w:t xml:space="preserve">MPI </w:t>
-      </w:r>
-      <w:r>
-        <w:rPr>
-          <w:rFonts w:ascii="Tahoma" w:hAnsi="Tahoma" w:cs="Tahoma"/>
-          <w:sz w:val="22"/>
-        </w:rPr>
-        <w:t>通信时间、</w:t>
-      </w:r>
-      <w:r>
-        <w:rPr>
-          <w:rFonts w:ascii="Tahoma" w:hAnsi="Tahoma" w:cs="Tahoma"/>
-          <w:sz w:val="22"/>
-        </w:rPr>
-        <w:t xml:space="preserve">OpenMP </w:t>
-      </w:r>
-      <w:r>
-        <w:rPr>
-          <w:rFonts w:ascii="Tahoma" w:hAnsi="Tahoma" w:cs="Tahoma"/>
-          <w:sz w:val="22"/>
-        </w:rPr>
-        <w:t>占比、线程利用率和潜在负载不均衡问题，评估</w:t>
-      </w:r>
-      <w:r>
-        <w:rPr>
-          <w:rFonts w:ascii="Tahoma" w:hAnsi="Tahoma" w:cs="Tahoma"/>
-          <w:sz w:val="22"/>
-        </w:rPr>
-        <w:t xml:space="preserve"> hybrid execution </w:t>
-      </w:r>
-      <w:r>
-        <w:rPr>
-          <w:rFonts w:ascii="Tahoma" w:hAnsi="Tahoma" w:cs="Tahoma"/>
-          <w:sz w:val="22"/>
-        </w:rPr>
-        <w:t>在不同问题规模下的适用场景。</w:t>
+        <w:t>结合</w:t>
+      </w:r>
+      <w:r>
+        <w:rPr>
+          <w:rFonts w:ascii="Tahoma" w:hAnsi="Tahoma" w:cs="Tahoma"/>
+          <w:sz w:val="22"/>
+        </w:rPr>
+        <w:t xml:space="preserve"> strong scaling</w:t>
+      </w:r>
+      <w:r>
+        <w:rPr>
+          <w:rFonts w:ascii="Tahoma" w:hAnsi="Tahoma" w:cs="Tahoma"/>
+          <w:sz w:val="22"/>
+        </w:rPr>
+        <w:t>、</w:t>
+      </w:r>
+      <w:r>
+        <w:rPr>
+          <w:rFonts w:ascii="Tahoma" w:hAnsi="Tahoma" w:cs="Tahoma"/>
+          <w:sz w:val="22"/>
+        </w:rPr>
+        <w:t>Amdahl</w:t>
+      </w:r>
+      <w:proofErr w:type="gramStart"/>
+      <w:r>
+        <w:rPr>
+          <w:rFonts w:ascii="Tahoma" w:hAnsi="Tahoma" w:cs="Tahoma"/>
+          <w:sz w:val="22"/>
+        </w:rPr>
+        <w:t>’</w:t>
+      </w:r>
+      <w:proofErr w:type="gramEnd"/>
+      <w:r>
+        <w:rPr>
+          <w:rFonts w:ascii="Tahoma" w:hAnsi="Tahoma" w:cs="Tahoma"/>
+          <w:sz w:val="22"/>
+        </w:rPr>
+        <w:t>s Law</w:t>
+      </w:r>
+      <w:r>
+        <w:rPr>
+          <w:rFonts w:ascii="Tahoma" w:hAnsi="Tahoma" w:cs="Tahoma"/>
+          <w:sz w:val="22"/>
+        </w:rPr>
+        <w:t>、进程</w:t>
+      </w:r>
+      <w:r>
+        <w:rPr>
+          <w:rFonts w:ascii="Tahoma" w:hAnsi="Tahoma" w:cs="Tahoma"/>
+          <w:sz w:val="22"/>
+        </w:rPr>
+        <w:t xml:space="preserve"> / </w:t>
+      </w:r>
+      <w:r>
+        <w:rPr>
+          <w:rFonts w:ascii="Tahoma" w:hAnsi="Tahoma" w:cs="Tahoma"/>
+          <w:sz w:val="22"/>
+        </w:rPr>
+        <w:t>线程模型、</w:t>
+      </w:r>
+      <w:r>
+        <w:rPr>
+          <w:rFonts w:ascii="Tahoma" w:hAnsi="Tahoma" w:cs="Tahoma"/>
+          <w:sz w:val="22"/>
+        </w:rPr>
+        <w:t>Cache locality</w:t>
+      </w:r>
+      <w:r>
+        <w:rPr>
+          <w:rFonts w:ascii="Tahoma" w:hAnsi="Tahoma" w:cs="Tahoma"/>
+          <w:sz w:val="22"/>
+        </w:rPr>
+        <w:t>、</w:t>
+      </w:r>
+      <w:r>
+        <w:rPr>
+          <w:rFonts w:ascii="Tahoma" w:hAnsi="Tahoma" w:cs="Tahoma"/>
+          <w:sz w:val="22"/>
+        </w:rPr>
+        <w:t xml:space="preserve">NUMA </w:t>
+      </w:r>
+      <w:r>
+        <w:rPr>
+          <w:rFonts w:ascii="Tahoma" w:hAnsi="Tahoma" w:cs="Tahoma"/>
+          <w:sz w:val="22"/>
+        </w:rPr>
+        <w:t>和</w:t>
+      </w:r>
+      <w:r>
+        <w:rPr>
+          <w:rFonts w:ascii="Tahoma" w:hAnsi="Tahoma" w:cs="Tahoma"/>
+          <w:sz w:val="22"/>
+        </w:rPr>
+        <w:t xml:space="preserve"> memory bandwidth </w:t>
+      </w:r>
+      <w:r>
+        <w:rPr>
+          <w:rFonts w:ascii="Tahoma" w:hAnsi="Tahoma" w:cs="Tahoma"/>
+          <w:sz w:val="22"/>
+        </w:rPr>
+        <w:t>等基础概念分析实验结果，定位并行效率下降的可能原因。</w:t>
       </w:r>
     </w:p>
     <w:p>
@@ -2528,91 +2975,44 @@
           <w:rFonts w:ascii="Tahoma" w:hAnsi="Tahoma" w:cs="Tahoma"/>
           <w:sz w:val="22"/>
         </w:rPr>
-        <w:t>结合</w:t>
-      </w:r>
-      <w:r>
-        <w:rPr>
-          <w:rFonts w:ascii="Tahoma" w:hAnsi="Tahoma" w:cs="Tahoma"/>
-          <w:sz w:val="22"/>
-        </w:rPr>
-        <w:t xml:space="preserve"> strong scaling</w:t>
-      </w:r>
-      <w:r>
-        <w:rPr>
-          <w:rFonts w:ascii="Tahoma" w:hAnsi="Tahoma" w:cs="Tahoma"/>
-          <w:sz w:val="22"/>
-        </w:rPr>
-        <w:t>、</w:t>
-      </w:r>
-      <w:r>
-        <w:rPr>
-          <w:rFonts w:ascii="Tahoma" w:hAnsi="Tahoma" w:cs="Tahoma"/>
-          <w:sz w:val="22"/>
-        </w:rPr>
-        <w:t>Amdahl’s Law</w:t>
-      </w:r>
-      <w:r>
-        <w:rPr>
-          <w:rFonts w:ascii="Tahoma" w:hAnsi="Tahoma" w:cs="Tahoma"/>
-          <w:sz w:val="22"/>
-        </w:rPr>
-        <w:t>、进程</w:t>
-      </w:r>
-      <w:r>
-        <w:rPr>
-          <w:rFonts w:ascii="Tahoma" w:hAnsi="Tahoma" w:cs="Tahoma"/>
-          <w:sz w:val="22"/>
-        </w:rPr>
-        <w:t xml:space="preserve"> / </w:t>
-      </w:r>
-      <w:r>
-        <w:rPr>
-          <w:rFonts w:ascii="Tahoma" w:hAnsi="Tahoma" w:cs="Tahoma"/>
-          <w:sz w:val="22"/>
-        </w:rPr>
-        <w:t>线程模型、</w:t>
-      </w:r>
-      <w:r>
-        <w:rPr>
-          <w:rFonts w:ascii="Tahoma" w:hAnsi="Tahoma" w:cs="Tahoma"/>
-          <w:sz w:val="22"/>
-        </w:rPr>
-        <w:t>Cache locality</w:t>
-      </w:r>
-      <w:r>
-        <w:rPr>
-          <w:rFonts w:ascii="Tahoma" w:hAnsi="Tahoma" w:cs="Tahoma"/>
-          <w:sz w:val="22"/>
-        </w:rPr>
-        <w:t>、</w:t>
-      </w:r>
-      <w:r>
-        <w:rPr>
-          <w:rFonts w:ascii="Tahoma" w:hAnsi="Tahoma" w:cs="Tahoma"/>
-          <w:sz w:val="22"/>
-        </w:rPr>
-        <w:t xml:space="preserve">NUMA </w:t>
-      </w:r>
-      <w:r>
-        <w:rPr>
-          <w:rFonts w:ascii="Tahoma" w:hAnsi="Tahoma" w:cs="Tahoma"/>
-          <w:sz w:val="22"/>
-        </w:rPr>
-        <w:t>和</w:t>
-      </w:r>
-      <w:r>
-        <w:rPr>
-          <w:rFonts w:ascii="Tahoma" w:hAnsi="Tahoma" w:cs="Tahoma"/>
-          <w:sz w:val="22"/>
-        </w:rPr>
-        <w:t xml:space="preserve"> memory bandwidth </w:t>
-      </w:r>
-      <w:r>
-        <w:rPr>
-          <w:rFonts w:ascii="Tahoma" w:hAnsi="Tahoma" w:cs="Tahoma"/>
-          <w:sz w:val="22"/>
-        </w:rPr>
-        <w:t>等基础</w:t>
+        <w:t>整理实验文档、运行说明和结果分析报告，使</w:t>
+      </w:r>
+      <w:r>
+        <w:rPr>
+          <w:rFonts w:ascii="Tahoma" w:hAnsi="Tahoma" w:cs="Tahoma"/>
+          <w:sz w:val="22"/>
+        </w:rPr>
+        <w:t xml:space="preserve"> benchmark </w:t>
+      </w:r>
+      <w:r>
+        <w:rPr>
+          <w:rFonts w:ascii="Tahoma" w:hAnsi="Tahoma" w:cs="Tahoma"/>
+          <w:sz w:val="22"/>
+        </w:rPr>
+        <w:t>流程具备可复现性，并支持后续扩展到更多</w:t>
+      </w:r>
+      <w:r>
+        <w:rPr>
+          <w:rFonts w:ascii="Tahoma" w:hAnsi="Tahoma" w:cs="Tahoma"/>
+          <w:sz w:val="22"/>
+        </w:rPr>
+        <w:t xml:space="preserve"> </w:t>
+      </w:r>
+      <w:proofErr w:type="spellStart"/>
+      <w:r>
+        <w:rPr>
+          <w:rFonts w:ascii="Tahoma" w:hAnsi="Tahoma" w:cs="Tahoma"/>
+          <w:sz w:val="22"/>
+        </w:rPr>
+        <w:t>PETSc</w:t>
+      </w:r>
+      <w:proofErr w:type="spellEnd"/>
+      <w:r>
+        <w:rPr>
+          <w:rFonts w:ascii="Tahoma" w:hAnsi="Tahoma" w:cs="Tahoma"/>
+          <w:sz w:val="22"/>
+        </w:rPr>
+        <w:t xml:space="preserve"> </w:t>
       </w:r>
       <w:r>
         <w:rPr>
@@ -2620,71 +3020,86 @@
           <w:sz w:val="22"/>
         </w:rPr>
         <w:lastRenderedPageBreak/>
-        <w:t>概念分析实验结果，定位并行效率下降的可能原因。</w:t>
+        <w:t>examples</w:t>
+      </w:r>
+      <w:r>
+        <w:rPr>
+          <w:rFonts w:ascii="Tahoma" w:hAnsi="Tahoma" w:cs="Tahoma"/>
+          <w:sz w:val="22"/>
+        </w:rPr>
+        <w:t>、矩阵格式、问题规模和并行配置。</w:t>
       </w:r>
     </w:p>
     <w:p>
       <w:pPr>
-        <w:numPr>
-          <w:ilvl w:val="0"/>
-          <w:numId w:val="15"/>
-        </w:numPr>
-        <w:rPr>
-          <w:rFonts w:ascii="Tahoma" w:hAnsi="Tahoma" w:cs="Tahoma"/>
-          <w:sz w:val="22"/>
-        </w:rPr>
-      </w:pPr>
-      <w:r>
-        <w:rPr>
-          <w:rFonts w:ascii="Tahoma" w:hAnsi="Tahoma" w:cs="Tahoma"/>
-          <w:sz w:val="22"/>
-        </w:rPr>
-        <w:t>整理实验文档、运行说明和结果分析报告，使</w:t>
-      </w:r>
-      <w:r>
-        <w:rPr>
-          <w:rFonts w:ascii="Tahoma" w:hAnsi="Tahoma" w:cs="Tahoma"/>
-          <w:sz w:val="22"/>
-        </w:rPr>
-        <w:t xml:space="preserve"> benchmark </w:t>
-      </w:r>
-      <w:r>
-        <w:rPr>
-          <w:rFonts w:ascii="Tahoma" w:hAnsi="Tahoma" w:cs="Tahoma"/>
-          <w:sz w:val="22"/>
-        </w:rPr>
-        <w:t>流程具备可复现性，并支持后续扩展到更多</w:t>
-      </w:r>
-      <w:r>
-        <w:rPr>
-          <w:rFonts w:ascii="Tahoma" w:hAnsi="Tahoma" w:cs="Tahoma"/>
-          <w:sz w:val="22"/>
-        </w:rPr>
-        <w:t xml:space="preserve"> PETSc examples</w:t>
-      </w:r>
-      <w:r>
-        <w:rPr>
-          <w:rFonts w:ascii="Tahoma" w:hAnsi="Tahoma" w:cs="Tahoma"/>
-          <w:sz w:val="22"/>
-        </w:rPr>
-        <w:t>、矩阵格式、问题规模和并行配置。</w:t>
+        <w:rPr>
+          <w:rFonts w:ascii="Tahoma" w:hAnsi="Tahoma" w:cs="Tahoma"/>
+          <w:szCs w:val="21"/>
+        </w:rPr>
+      </w:pPr>
+      <w:r>
+        <w:rPr>
+          <w:rFonts w:ascii="Tahoma" w:hAnsi="Tahoma" w:cs="Tahoma"/>
+          <w:szCs w:val="21"/>
+        </w:rPr>
+        <w:pict w14:anchorId="379C6A97">
+          <v:rect id="_x0000_i1038" style="width:0;height:1.5pt" o:hralign="center" o:hrstd="t" o:hr="t" fillcolor="#a0a0a0" stroked="f"/>
+        </w:pict>
       </w:r>
     </w:p>
     <w:p>
       <w:pPr>
         <w:rPr>
           <w:rFonts w:ascii="Tahoma" w:hAnsi="Tahoma" w:cs="Tahoma"/>
-          <w:szCs w:val="21"/>
-        </w:rPr>
-      </w:pPr>
-      <w:r>
-        <w:rPr>
-          <w:rFonts w:ascii="Tahoma" w:hAnsi="Tahoma" w:cs="Tahoma"/>
-          <w:szCs w:val="21"/>
-        </w:rPr>
-        <w:pict w14:anchorId="75B227E0">
-          <v:rect id="_x0000_i1028" style="width:0;height:1.5pt" o:hralign="center" o:hrstd="t" o:hr="t" fillcolor="#a0a0a0" stroked="f"/>
-        </w:pict>
+          <w:b/>
+          <w:bCs/>
+          <w:sz w:val="22"/>
+        </w:rPr>
+      </w:pPr>
+      <w:r>
+        <w:rPr>
+          <w:rFonts w:ascii="Tahoma" w:hAnsi="Tahoma" w:cs="Tahoma"/>
+          <w:b/>
+          <w:bCs/>
+          <w:sz w:val="22"/>
+        </w:rPr>
+        <w:t>面向</w:t>
+      </w:r>
+      <w:r>
+        <w:rPr>
+          <w:rFonts w:ascii="Tahoma" w:hAnsi="Tahoma" w:cs="Tahoma"/>
+          <w:b/>
+          <w:bCs/>
+          <w:sz w:val="22"/>
+        </w:rPr>
+        <w:t xml:space="preserve"> HPC Benchmark </w:t>
+      </w:r>
+      <w:r>
+        <w:rPr>
+          <w:rFonts w:ascii="Tahoma" w:hAnsi="Tahoma" w:cs="Tahoma"/>
+          <w:b/>
+          <w:bCs/>
+          <w:sz w:val="22"/>
+        </w:rPr>
+        <w:t>的</w:t>
+      </w:r>
+      <w:r>
+        <w:rPr>
+          <w:rFonts w:ascii="Tahoma" w:hAnsi="Tahoma" w:cs="Tahoma"/>
+          <w:b/>
+          <w:bCs/>
+          <w:sz w:val="22"/>
+        </w:rPr>
+        <w:t xml:space="preserve"> AI Agent </w:t>
+      </w:r>
+      <w:r>
+        <w:rPr>
+          <w:rFonts w:ascii="Tahoma" w:hAnsi="Tahoma" w:cs="Tahoma"/>
+          <w:b/>
+          <w:bCs/>
+          <w:sz w:val="22"/>
+        </w:rPr>
+        <w:t>智能性能分析系统</w:t>
       </w:r>
     </w:p>
     <w:p>
@@ -2703,31 +3118,48 @@
           <w:bCs/>
           <w:sz w:val="22"/>
         </w:rPr>
-        <w:t>面向</w:t>
-      </w:r>
-      <w:r>
-        <w:rPr>
-          <w:rFonts w:ascii="Tahoma" w:hAnsi="Tahoma" w:cs="Tahoma"/>
-          <w:b/>
-          <w:bCs/>
-          <w:sz w:val="22"/>
-        </w:rPr>
-        <w:t xml:space="preserve"> HPC Benchmark </w:t>
-      </w:r>
-      <w:r>
-        <w:rPr>
-          <w:rFonts w:ascii="Tahoma" w:hAnsi="Tahoma" w:cs="Tahoma"/>
-          <w:b/>
-          <w:bCs/>
-          <w:sz w:val="22"/>
-        </w:rPr>
-        <w:t>的</w:t>
-      </w:r>
-      <w:r>
-        <w:rPr>
-          <w:rFonts w:ascii="Tahoma" w:hAnsi="Tahoma" w:cs="Tahoma"/>
-          <w:b/>
-          <w:bCs/>
+        <w:t>项目描述：</w:t>
+      </w:r>
+      <w:r>
+        <w:rPr>
+          <w:rFonts w:ascii="Tahoma" w:hAnsi="Tahoma" w:cs="Tahoma"/>
+          <w:sz w:val="22"/>
+        </w:rPr>
+        <w:t>基于</w:t>
+      </w:r>
+      <w:r>
+        <w:rPr>
+          <w:rFonts w:ascii="Tahoma" w:hAnsi="Tahoma" w:cs="Tahoma"/>
+          <w:sz w:val="22"/>
+        </w:rPr>
+        <w:t xml:space="preserve"> </w:t>
+      </w:r>
+      <w:proofErr w:type="spellStart"/>
+      <w:r>
+        <w:rPr>
+          <w:rFonts w:ascii="Tahoma" w:hAnsi="Tahoma" w:cs="Tahoma"/>
+          <w:sz w:val="22"/>
+        </w:rPr>
+        <w:t>PETSc</w:t>
+      </w:r>
+      <w:proofErr w:type="spellEnd"/>
+      <w:r>
+        <w:rPr>
+          <w:rFonts w:ascii="Tahoma" w:hAnsi="Tahoma" w:cs="Tahoma"/>
+          <w:sz w:val="22"/>
+        </w:rPr>
+        <w:t xml:space="preserve"> benchmark </w:t>
+      </w:r>
+      <w:r>
+        <w:rPr>
+          <w:rFonts w:ascii="Tahoma" w:hAnsi="Tahoma" w:cs="Tahoma"/>
+          <w:sz w:val="22"/>
+        </w:rPr>
+        <w:t>产生的实验日志、性能指标和分析文档，构建一个面向高性能计算实验场景的</w:t>
+      </w:r>
+      <w:r>
+        <w:rPr>
+          <w:rFonts w:ascii="Tahoma" w:hAnsi="Tahoma" w:cs="Tahoma"/>
           <w:sz w:val="22"/>
         </w:rPr>
         <w:t xml:space="preserve"> AI Agent </w:t>
@@ -2735,11 +3167,169 @@
       <w:r>
         <w:rPr>
           <w:rFonts w:ascii="Tahoma" w:hAnsi="Tahoma" w:cs="Tahoma"/>
-          <w:b/>
-          <w:bCs/>
-          <w:sz w:val="22"/>
-        </w:rPr>
-        <w:t>智能性能分析系统</w:t>
+          <w:sz w:val="22"/>
+        </w:rPr>
+        <w:t>性能分析系统。系统支持导入</w:t>
+      </w:r>
+      <w:r>
+        <w:rPr>
+          <w:rFonts w:ascii="Tahoma" w:hAnsi="Tahoma" w:cs="Tahoma"/>
+          <w:sz w:val="22"/>
+        </w:rPr>
+        <w:t xml:space="preserve"> </w:t>
+      </w:r>
+      <w:proofErr w:type="spellStart"/>
+      <w:r>
+        <w:rPr>
+          <w:rFonts w:ascii="Tahoma" w:hAnsi="Tahoma" w:cs="Tahoma"/>
+          <w:sz w:val="22"/>
+        </w:rPr>
+        <w:t>Slurm</w:t>
+      </w:r>
+      <w:proofErr w:type="spellEnd"/>
+      <w:r>
+        <w:rPr>
+          <w:rFonts w:ascii="Tahoma" w:hAnsi="Tahoma" w:cs="Tahoma"/>
+          <w:sz w:val="22"/>
+        </w:rPr>
+        <w:t xml:space="preserve"> / </w:t>
+      </w:r>
+      <w:proofErr w:type="spellStart"/>
+      <w:r>
+        <w:rPr>
+          <w:rFonts w:ascii="Tahoma" w:hAnsi="Tahoma" w:cs="Tahoma"/>
+          <w:sz w:val="22"/>
+        </w:rPr>
+        <w:t>PETSc</w:t>
+      </w:r>
+      <w:proofErr w:type="spellEnd"/>
+      <w:r>
+        <w:rPr>
+          <w:rFonts w:ascii="Tahoma" w:hAnsi="Tahoma" w:cs="Tahoma"/>
+          <w:sz w:val="22"/>
+        </w:rPr>
+        <w:t xml:space="preserve"> </w:t>
+      </w:r>
+      <w:r>
+        <w:rPr>
+          <w:rFonts w:ascii="Tahoma" w:hAnsi="Tahoma" w:cs="Tahoma"/>
+          <w:sz w:val="22"/>
+        </w:rPr>
+        <w:t>运行日志，解析并存储实验结果，查询不同并行配置下的性能表现，并结合</w:t>
+      </w:r>
+      <w:r>
+        <w:rPr>
+          <w:rFonts w:ascii="Tahoma" w:hAnsi="Tahoma" w:cs="Tahoma"/>
+          <w:sz w:val="22"/>
+        </w:rPr>
+        <w:t xml:space="preserve"> RAG </w:t>
+      </w:r>
+      <w:r>
+        <w:rPr>
+          <w:rFonts w:ascii="Tahoma" w:hAnsi="Tahoma" w:cs="Tahoma"/>
+          <w:sz w:val="22"/>
+        </w:rPr>
+        <w:t>检索、</w:t>
+      </w:r>
+      <w:r>
+        <w:rPr>
+          <w:rFonts w:ascii="Tahoma" w:hAnsi="Tahoma" w:cs="Tahoma"/>
+          <w:sz w:val="22"/>
+        </w:rPr>
+        <w:t xml:space="preserve">Agent </w:t>
+      </w:r>
+      <w:r>
+        <w:rPr>
+          <w:rFonts w:ascii="Tahoma" w:hAnsi="Tahoma" w:cs="Tahoma"/>
+          <w:sz w:val="22"/>
+        </w:rPr>
+        <w:t>工具调用、数据库查询、缓存优化和</w:t>
+      </w:r>
+      <w:r>
+        <w:rPr>
+          <w:rFonts w:ascii="Tahoma" w:hAnsi="Tahoma" w:cs="Tahoma"/>
+          <w:sz w:val="22"/>
+        </w:rPr>
+        <w:t xml:space="preserve"> Markdown </w:t>
+      </w:r>
+      <w:r>
+        <w:rPr>
+          <w:rFonts w:ascii="Tahoma" w:hAnsi="Tahoma" w:cs="Tahoma"/>
+          <w:sz w:val="22"/>
+        </w:rPr>
+        <w:t>报告生成，辅助分析</w:t>
+      </w:r>
+      <w:r>
+        <w:rPr>
+          <w:rFonts w:ascii="Tahoma" w:hAnsi="Tahoma" w:cs="Tahoma"/>
+          <w:sz w:val="22"/>
+        </w:rPr>
+        <w:t xml:space="preserve"> MPI-only </w:t>
+      </w:r>
+      <w:r>
+        <w:rPr>
+          <w:rFonts w:ascii="Tahoma" w:hAnsi="Tahoma" w:cs="Tahoma"/>
+          <w:sz w:val="22"/>
+        </w:rPr>
+        <w:t>与</w:t>
+      </w:r>
+      <w:r>
+        <w:rPr>
+          <w:rFonts w:ascii="Tahoma" w:hAnsi="Tahoma" w:cs="Tahoma"/>
+          <w:sz w:val="22"/>
+        </w:rPr>
+        <w:t xml:space="preserve"> hybrid </w:t>
+      </w:r>
+      <w:proofErr w:type="spellStart"/>
+      <w:r>
+        <w:rPr>
+          <w:rFonts w:ascii="Tahoma" w:hAnsi="Tahoma" w:cs="Tahoma"/>
+          <w:sz w:val="22"/>
+        </w:rPr>
+        <w:t>MPI+OpenMP</w:t>
+      </w:r>
+      <w:proofErr w:type="spellEnd"/>
+      <w:r>
+        <w:rPr>
+          <w:rFonts w:ascii="Tahoma" w:hAnsi="Tahoma" w:cs="Tahoma"/>
+          <w:sz w:val="22"/>
+        </w:rPr>
+        <w:t xml:space="preserve"> </w:t>
+      </w:r>
+      <w:r>
+        <w:rPr>
+          <w:rFonts w:ascii="Tahoma" w:hAnsi="Tahoma" w:cs="Tahoma"/>
+          <w:sz w:val="22"/>
+        </w:rPr>
+        <w:t>配置下的性能差异。项目目标是将</w:t>
+      </w:r>
+      <w:r>
+        <w:rPr>
+          <w:rFonts w:ascii="Tahoma" w:hAnsi="Tahoma" w:cs="Tahoma"/>
+          <w:sz w:val="22"/>
+        </w:rPr>
+        <w:t xml:space="preserve"> HPC benchmark </w:t>
+      </w:r>
+      <w:r>
+        <w:rPr>
+          <w:rFonts w:ascii="Tahoma" w:hAnsi="Tahoma" w:cs="Tahoma"/>
+          <w:sz w:val="22"/>
+        </w:rPr>
+        <w:t>数据、实验文档和智能问答流程结合起来，形成一个可扩展的</w:t>
+      </w:r>
+      <w:r>
+        <w:rPr>
+          <w:rFonts w:ascii="Tahoma" w:hAnsi="Tahoma" w:cs="Tahoma"/>
+          <w:sz w:val="22"/>
+        </w:rPr>
+        <w:t xml:space="preserve"> AI Infrastructure </w:t>
+      </w:r>
+      <w:r>
+        <w:rPr>
+          <w:rFonts w:ascii="Tahoma" w:hAnsi="Tahoma" w:cs="Tahoma"/>
+          <w:sz w:val="22"/>
+        </w:rPr>
+        <w:t>分析工具</w:t>
       </w:r>
     </w:p>
     <w:p>
@@ -2758,173 +3348,27 @@
           <w:bCs/>
           <w:sz w:val="22"/>
         </w:rPr>
-        <w:t>项目描述：</w:t>
-      </w:r>
-      <w:r>
-        <w:rPr>
-          <w:rFonts w:ascii="Tahoma" w:hAnsi="Tahoma" w:cs="Tahoma"/>
-          <w:sz w:val="22"/>
-        </w:rPr>
-        <w:t>该项目基于</w:t>
-      </w:r>
-      <w:r>
-        <w:rPr>
-          <w:rFonts w:ascii="Tahoma" w:hAnsi="Tahoma" w:cs="Tahoma"/>
-          <w:sz w:val="22"/>
-        </w:rPr>
-        <w:t xml:space="preserve"> PETSc benchmark </w:t>
-      </w:r>
-      <w:r>
-        <w:rPr>
-          <w:rFonts w:ascii="Tahoma" w:hAnsi="Tahoma" w:cs="Tahoma"/>
-          <w:sz w:val="22"/>
-        </w:rPr>
-        <w:t>产生的实验日志、性能指标和分析文档，构建一个面向高性能计算实验场景的</w:t>
-      </w:r>
-      <w:r>
-        <w:rPr>
-          <w:rFonts w:ascii="Tahoma" w:hAnsi="Tahoma" w:cs="Tahoma"/>
-          <w:sz w:val="22"/>
-        </w:rPr>
-        <w:t xml:space="preserve"> AI Agent </w:t>
-      </w:r>
-      <w:r>
-        <w:rPr>
-          <w:rFonts w:ascii="Tahoma" w:hAnsi="Tahoma" w:cs="Tahoma"/>
-          <w:sz w:val="22"/>
-        </w:rPr>
-        <w:t>性能分析系统。系统支持导入</w:t>
-      </w:r>
-      <w:r>
-        <w:rPr>
-          <w:rFonts w:ascii="Tahoma" w:hAnsi="Tahoma" w:cs="Tahoma"/>
-          <w:sz w:val="22"/>
-        </w:rPr>
-        <w:t xml:space="preserve"> Slurm / PETSc </w:t>
-      </w:r>
-      <w:r>
-        <w:rPr>
-          <w:rFonts w:ascii="Tahoma" w:hAnsi="Tahoma" w:cs="Tahoma"/>
-          <w:sz w:val="22"/>
-        </w:rPr>
-        <w:t>运行日志，解析并存储实验结果，查询不同并行配置下的性能表现，并结合</w:t>
-      </w:r>
-      <w:r>
-        <w:rPr>
-          <w:rFonts w:ascii="Tahoma" w:hAnsi="Tahoma" w:cs="Tahoma"/>
-          <w:sz w:val="22"/>
-        </w:rPr>
-        <w:t xml:space="preserve"> RAG </w:t>
-      </w:r>
-      <w:r>
-        <w:rPr>
-          <w:rFonts w:ascii="Tahoma" w:hAnsi="Tahoma" w:cs="Tahoma"/>
-          <w:sz w:val="22"/>
-        </w:rPr>
-        <w:t>检索、</w:t>
-      </w:r>
-      <w:r>
-        <w:rPr>
-          <w:rFonts w:ascii="Tahoma" w:hAnsi="Tahoma" w:cs="Tahoma"/>
-          <w:sz w:val="22"/>
-        </w:rPr>
-        <w:t xml:space="preserve">Agent </w:t>
-      </w:r>
-      <w:r>
-        <w:rPr>
-          <w:rFonts w:ascii="Tahoma" w:hAnsi="Tahoma" w:cs="Tahoma"/>
-          <w:sz w:val="22"/>
-        </w:rPr>
-        <w:t>工具调用、数据库查询、缓存优化和</w:t>
-      </w:r>
-      <w:r>
-        <w:rPr>
-          <w:rFonts w:ascii="Tahoma" w:hAnsi="Tahoma" w:cs="Tahoma"/>
-          <w:sz w:val="22"/>
-        </w:rPr>
-        <w:t xml:space="preserve"> Markdown </w:t>
-      </w:r>
-      <w:r>
-        <w:rPr>
-          <w:rFonts w:ascii="Tahoma" w:hAnsi="Tahoma" w:cs="Tahoma"/>
-          <w:sz w:val="22"/>
-        </w:rPr>
-        <w:t>报告生成，辅助分析</w:t>
-      </w:r>
-      <w:r>
-        <w:rPr>
-          <w:rFonts w:ascii="Tahoma" w:hAnsi="Tahoma" w:cs="Tahoma"/>
-          <w:sz w:val="22"/>
-        </w:rPr>
-        <w:t xml:space="preserve"> MPI-only </w:t>
-      </w:r>
-      <w:r>
-        <w:rPr>
-          <w:rFonts w:ascii="Tahoma" w:hAnsi="Tahoma" w:cs="Tahoma"/>
-          <w:sz w:val="22"/>
-        </w:rPr>
-        <w:t>与</w:t>
-      </w:r>
-      <w:r>
-        <w:rPr>
-          <w:rFonts w:ascii="Tahoma" w:hAnsi="Tahoma" w:cs="Tahoma"/>
-          <w:sz w:val="22"/>
-        </w:rPr>
-        <w:t xml:space="preserve"> hybrid MPI+OpenMP </w:t>
-      </w:r>
-      <w:r>
-        <w:rPr>
-          <w:rFonts w:ascii="Tahoma" w:hAnsi="Tahoma" w:cs="Tahoma"/>
-          <w:sz w:val="22"/>
-        </w:rPr>
-        <w:t>配置下的性能差异。项目目标是将</w:t>
-      </w:r>
-      <w:r>
-        <w:rPr>
-          <w:rFonts w:ascii="Tahoma" w:hAnsi="Tahoma" w:cs="Tahoma"/>
-          <w:sz w:val="22"/>
-        </w:rPr>
-        <w:t xml:space="preserve"> HPC benchmark </w:t>
-      </w:r>
-      <w:r>
-        <w:rPr>
-          <w:rFonts w:ascii="Tahoma" w:hAnsi="Tahoma" w:cs="Tahoma"/>
-          <w:sz w:val="22"/>
-        </w:rPr>
-        <w:t>数据、实验文档和智能问答流程结合起来，形成一个可扩展的</w:t>
-      </w:r>
-      <w:r>
-        <w:rPr>
-          <w:rFonts w:ascii="Tahoma" w:hAnsi="Tahoma" w:cs="Tahoma"/>
-          <w:sz w:val="22"/>
-        </w:rPr>
-        <w:t xml:space="preserve"> AI Infrastructure </w:t>
-      </w:r>
-      <w:r>
-        <w:rPr>
-          <w:rFonts w:ascii="Tahoma" w:hAnsi="Tahoma" w:cs="Tahoma"/>
-          <w:sz w:val="22"/>
-        </w:rPr>
-        <w:t>分析工具</w:t>
-      </w:r>
-    </w:p>
-    <w:p>
-      <w:pPr>
-        <w:rPr>
-          <w:rFonts w:ascii="Tahoma" w:hAnsi="Tahoma" w:cs="Tahoma"/>
-          <w:b/>
-          <w:bCs/>
-          <w:sz w:val="22"/>
-        </w:rPr>
-      </w:pPr>
-      <w:r>
-        <w:rPr>
-          <w:rFonts w:ascii="Tahoma" w:hAnsi="Tahoma" w:cs="Tahoma"/>
-          <w:b/>
-          <w:bCs/>
-          <w:sz w:val="22"/>
-        </w:rPr>
-        <w:t>技术栈：</w:t>
+        <w:t>技术</w:t>
+      </w:r>
+      <w:proofErr w:type="gramStart"/>
+      <w:r>
+        <w:rPr>
+          <w:rFonts w:ascii="Tahoma" w:hAnsi="Tahoma" w:cs="Tahoma"/>
+          <w:b/>
+          <w:bCs/>
+          <w:sz w:val="22"/>
+        </w:rPr>
+        <w:t>栈</w:t>
+      </w:r>
+      <w:proofErr w:type="gramEnd"/>
+      <w:r>
+        <w:rPr>
+          <w:rFonts w:ascii="Tahoma" w:hAnsi="Tahoma" w:cs="Tahoma"/>
+          <w:b/>
+          <w:bCs/>
+          <w:sz w:val="22"/>
+        </w:rPr>
+        <w:t>：</w:t>
       </w:r>
       <w:r>
         <w:rPr>
@@ -2944,6 +3388,7 @@
         </w:rPr>
         <w:t>、</w:t>
       </w:r>
+      <w:proofErr w:type="spellStart"/>
       <w:r>
         <w:rPr>
           <w:rFonts w:ascii="Tahoma" w:hAnsi="Tahoma" w:cs="Tahoma"/>
@@ -2953,6 +3398,7 @@
         </w:rPr>
         <w:t>FastAPI</w:t>
       </w:r>
+      <w:proofErr w:type="spellEnd"/>
       <w:r>
         <w:rPr>
           <w:rFonts w:ascii="Tahoma" w:hAnsi="Tahoma" w:cs="Tahoma"/>
@@ -3052,15 +3498,37 @@
         </w:rPr>
         <w:t>、</w:t>
       </w:r>
-      <w:r>
-        <w:rPr>
-          <w:rFonts w:ascii="Tahoma" w:hAnsi="Tahoma" w:cs="Tahoma"/>
-          <w:b/>
-          <w:bCs/>
-          <w:sz w:val="22"/>
-        </w:rPr>
-        <w:t>LangChain / LlamaIndex</w:t>
-      </w:r>
+      <w:proofErr w:type="spellStart"/>
+      <w:r>
+        <w:rPr>
+          <w:rFonts w:ascii="Tahoma" w:hAnsi="Tahoma" w:cs="Tahoma"/>
+          <w:b/>
+          <w:bCs/>
+          <w:sz w:val="22"/>
+        </w:rPr>
+        <w:t>LangChain</w:t>
+      </w:r>
+      <w:proofErr w:type="spellEnd"/>
+      <w:r>
+        <w:rPr>
+          <w:rFonts w:ascii="Tahoma" w:hAnsi="Tahoma" w:cs="Tahoma"/>
+          <w:b/>
+          <w:bCs/>
+          <w:sz w:val="22"/>
+        </w:rPr>
+        <w:t xml:space="preserve"> / </w:t>
+      </w:r>
+      <w:proofErr w:type="spellStart"/>
+      <w:r>
+        <w:rPr>
+          <w:rFonts w:ascii="Tahoma" w:hAnsi="Tahoma" w:cs="Tahoma"/>
+          <w:b/>
+          <w:bCs/>
+          <w:sz w:val="22"/>
+        </w:rPr>
+        <w:t>LlamaIndex</w:t>
+      </w:r>
+      <w:proofErr w:type="spellEnd"/>
       <w:r>
         <w:rPr>
           <w:rFonts w:ascii="Tahoma" w:hAnsi="Tahoma" w:cs="Tahoma"/>
@@ -3269,7 +3737,23 @@
           <w:rFonts w:ascii="Tahoma" w:hAnsi="Tahoma" w:cs="Tahoma"/>
           <w:sz w:val="22"/>
         </w:rPr>
-        <w:t xml:space="preserve"> FastAPI </w:t>
+        <w:t xml:space="preserve"> </w:t>
+      </w:r>
+      <w:proofErr w:type="spellStart"/>
+      <w:r>
+        <w:rPr>
+          <w:rFonts w:ascii="Tahoma" w:hAnsi="Tahoma" w:cs="Tahoma"/>
+          <w:sz w:val="22"/>
+        </w:rPr>
+        <w:t>FastAPI</w:t>
+      </w:r>
+      <w:proofErr w:type="spellEnd"/>
+      <w:r>
+        <w:rPr>
+          <w:rFonts w:ascii="Tahoma" w:hAnsi="Tahoma" w:cs="Tahoma"/>
+          <w:sz w:val="22"/>
+        </w:rPr>
+        <w:t xml:space="preserve"> </w:t>
       </w:r>
       <w:r>
         <w:rPr>
@@ -3316,7 +3800,39 @@
           <w:rFonts w:ascii="Tahoma" w:hAnsi="Tahoma" w:cs="Tahoma"/>
           <w:sz w:val="22"/>
         </w:rPr>
-        <w:t xml:space="preserve"> Slurm / PETSc </w:t>
+        <w:t xml:space="preserve"> </w:t>
+      </w:r>
+      <w:proofErr w:type="spellStart"/>
+      <w:r>
+        <w:rPr>
+          <w:rFonts w:ascii="Tahoma" w:hAnsi="Tahoma" w:cs="Tahoma"/>
+          <w:sz w:val="22"/>
+        </w:rPr>
+        <w:t>Slurm</w:t>
+      </w:r>
+      <w:proofErr w:type="spellEnd"/>
+      <w:r>
+        <w:rPr>
+          <w:rFonts w:ascii="Tahoma" w:hAnsi="Tahoma" w:cs="Tahoma"/>
+          <w:sz w:val="22"/>
+        </w:rPr>
+        <w:t xml:space="preserve"> / </w:t>
+      </w:r>
+      <w:proofErr w:type="spellStart"/>
+      <w:r>
+        <w:rPr>
+          <w:rFonts w:ascii="Tahoma" w:hAnsi="Tahoma" w:cs="Tahoma"/>
+          <w:sz w:val="22"/>
+        </w:rPr>
+        <w:t>PETSc</w:t>
+      </w:r>
+      <w:proofErr w:type="spellEnd"/>
+      <w:r>
+        <w:rPr>
+          <w:rFonts w:ascii="Tahoma" w:hAnsi="Tahoma" w:cs="Tahoma"/>
+          <w:sz w:val="22"/>
+        </w:rPr>
+        <w:t xml:space="preserve"> </w:t>
       </w:r>
       <w:r>
         <w:rPr>
@@ -3526,12 +4042,21 @@
         </w:rPr>
         <w:t>、</w:t>
       </w:r>
-      <w:r>
-        <w:rPr>
-          <w:rFonts w:ascii="Tahoma" w:hAnsi="Tahoma" w:cs="Tahoma"/>
-          <w:sz w:val="22"/>
-        </w:rPr>
-        <w:t xml:space="preserve">created_at </w:t>
+      <w:proofErr w:type="spellStart"/>
+      <w:r>
+        <w:rPr>
+          <w:rFonts w:ascii="Tahoma" w:hAnsi="Tahoma" w:cs="Tahoma"/>
+          <w:sz w:val="22"/>
+        </w:rPr>
+        <w:t>created_at</w:t>
+      </w:r>
+      <w:proofErr w:type="spellEnd"/>
+      <w:r>
+        <w:rPr>
+          <w:rFonts w:ascii="Tahoma" w:hAnsi="Tahoma" w:cs="Tahoma"/>
+          <w:sz w:val="22"/>
+        </w:rPr>
+        <w:t xml:space="preserve"> </w:t>
       </w:r>
       <w:r>
         <w:rPr>
@@ -3784,8 +4309,17 @@
           <w:rFonts w:ascii="Tahoma" w:hAnsi="Tahoma" w:cs="Tahoma"/>
           <w:sz w:val="22"/>
         </w:rPr>
-        <w:t xml:space="preserve"> PETSc</w:t>
-      </w:r>
+        <w:t xml:space="preserve"> </w:t>
+      </w:r>
+      <w:proofErr w:type="spellStart"/>
+      <w:r>
+        <w:rPr>
+          <w:rFonts w:ascii="Tahoma" w:hAnsi="Tahoma" w:cs="Tahoma"/>
+          <w:sz w:val="22"/>
+        </w:rPr>
+        <w:t>PETSc</w:t>
+      </w:r>
+      <w:proofErr w:type="spellEnd"/>
       <w:r>
         <w:rPr>
           <w:rFonts w:ascii="Tahoma" w:hAnsi="Tahoma" w:cs="Tahoma"/>
@@ -3821,6 +4355,7 @@
         </w:rPr>
         <w:t>、</w:t>
       </w:r>
+      <w:proofErr w:type="spellStart"/>
       <w:r>
         <w:rPr>
           <w:rFonts w:ascii="Tahoma" w:hAnsi="Tahoma" w:cs="Tahoma"/>
@@ -3828,19 +4363,29 @@
         </w:rPr>
         <w:t>Slurm</w:t>
       </w:r>
-      <w:r>
-        <w:rPr>
-          <w:rFonts w:ascii="Tahoma" w:hAnsi="Tahoma" w:cs="Tahoma"/>
-          <w:sz w:val="22"/>
-        </w:rPr>
-        <w:t>、</w:t>
-      </w:r>
-      <w:r>
-        <w:rPr>
-          <w:rFonts w:ascii="Tahoma" w:hAnsi="Tahoma" w:cs="Tahoma"/>
-          <w:sz w:val="22"/>
-        </w:rPr>
-        <w:t xml:space="preserve">Linaro MAP </w:t>
+      <w:proofErr w:type="spellEnd"/>
+      <w:r>
+        <w:rPr>
+          <w:rFonts w:ascii="Tahoma" w:hAnsi="Tahoma" w:cs="Tahoma"/>
+          <w:sz w:val="22"/>
+        </w:rPr>
+        <w:t>、</w:t>
+      </w:r>
+      <w:proofErr w:type="spellStart"/>
+      <w:r>
+        <w:rPr>
+          <w:rFonts w:ascii="Tahoma" w:hAnsi="Tahoma" w:cs="Tahoma"/>
+          <w:sz w:val="22"/>
+        </w:rPr>
+        <w:t>Linaro</w:t>
+      </w:r>
+      <w:proofErr w:type="spellEnd"/>
+      <w:r>
+        <w:rPr>
+          <w:rFonts w:ascii="Tahoma" w:hAnsi="Tahoma" w:cs="Tahoma"/>
+          <w:sz w:val="22"/>
+        </w:rPr>
+        <w:t xml:space="preserve"> MAP </w:t>
       </w:r>
       <w:r>
         <w:rPr>
@@ -4023,8 +4568,17 @@
           <w:rFonts w:ascii="Tahoma" w:hAnsi="Tahoma" w:cs="Tahoma"/>
           <w:sz w:val="22"/>
         </w:rPr>
-        <w:t xml:space="preserve"> TraceID</w:t>
-      </w:r>
+        <w:t xml:space="preserve"> </w:t>
+      </w:r>
+      <w:proofErr w:type="spellStart"/>
+      <w:r>
+        <w:rPr>
+          <w:rFonts w:ascii="Tahoma" w:hAnsi="Tahoma" w:cs="Tahoma"/>
+          <w:sz w:val="22"/>
+        </w:rPr>
+        <w:t>TraceID</w:t>
+      </w:r>
+      <w:proofErr w:type="spellEnd"/>
       <w:r>
         <w:rPr>
           <w:rFonts w:ascii="Tahoma" w:hAnsi="Tahoma" w:cs="Tahoma"/>
@@ -4117,20 +4671,16 @@
       <w:pPr>
         <w:rPr>
           <w:rFonts w:ascii="Tahoma" w:hAnsi="Tahoma" w:cs="Tahoma"/>
-          <w:b/>
-          <w:bCs/>
-          <w:sz w:val="22"/>
-        </w:rPr>
-      </w:pPr>
-      <w:r>
-        <w:rPr>
-          <w:rFonts w:ascii="Tahoma" w:hAnsi="Tahoma" w:cs="Tahoma"/>
-          <w:b/>
-          <w:bCs/>
-          <w:sz w:val="22"/>
-        </w:rPr>
-        <w:pict w14:anchorId="1681BD93">
-          <v:rect id="_x0000_i1029" style="width:0;height:1.5pt" o:hralign="center" o:hrstd="t" o:hr="t" fillcolor="#a0a0a0" stroked="f"/>
+          <w:szCs w:val="21"/>
+        </w:rPr>
+      </w:pPr>
+      <w:r>
+        <w:rPr>
+          <w:rFonts w:ascii="Tahoma" w:hAnsi="Tahoma" w:cs="Tahoma"/>
+          <w:szCs w:val="21"/>
+        </w:rPr>
+        <w:pict w14:anchorId="06B1E77E">
+          <v:rect id="_x0000_i1039" style="width:0;height:1.5pt" o:hralign="center" o:hrstd="t" o:hr="t" fillcolor="#a0a0a0" stroked="f"/>
         </w:pict>
       </w:r>
     </w:p>
@@ -4140,206 +4690,25 @@
           <w:rFonts w:ascii="Tahoma" w:hAnsi="Tahoma" w:cs="Tahoma"/>
           <w:b/>
           <w:bCs/>
-          <w:sz w:val="22"/>
-        </w:rPr>
-      </w:pPr>
-      <w:r>
-        <w:rPr>
-          <w:rFonts w:ascii="Tahoma" w:hAnsi="Tahoma" w:cs="Tahoma"/>
-          <w:b/>
-          <w:bCs/>
-          <w:sz w:val="22"/>
-        </w:rPr>
-        <w:t>可关联面试知识点：</w:t>
-      </w:r>
-      <w:r>
-        <w:rPr>
-          <w:rFonts w:ascii="Tahoma" w:hAnsi="Tahoma" w:cs="Tahoma"/>
-          <w:b/>
-          <w:bCs/>
-          <w:sz w:val="22"/>
-        </w:rPr>
-        <w:br/>
-        <w:t>MPI</w:t>
-      </w:r>
-      <w:r>
-        <w:rPr>
-          <w:rFonts w:ascii="Tahoma" w:hAnsi="Tahoma" w:cs="Tahoma"/>
-          <w:b/>
-          <w:bCs/>
-          <w:sz w:val="22"/>
-        </w:rPr>
-        <w:t>、</w:t>
-      </w:r>
-      <w:r>
-        <w:rPr>
-          <w:rFonts w:ascii="Tahoma" w:hAnsi="Tahoma" w:cs="Tahoma"/>
-          <w:b/>
-          <w:bCs/>
-          <w:sz w:val="22"/>
-        </w:rPr>
-        <w:t>OpenMP</w:t>
-      </w:r>
-      <w:r>
-        <w:rPr>
-          <w:rFonts w:ascii="Tahoma" w:hAnsi="Tahoma" w:cs="Tahoma"/>
-          <w:b/>
-          <w:bCs/>
-          <w:sz w:val="22"/>
-        </w:rPr>
-        <w:t>、进程与线程、并发执行、文件</w:t>
-      </w:r>
-      <w:r>
-        <w:rPr>
-          <w:rFonts w:ascii="Tahoma" w:hAnsi="Tahoma" w:cs="Tahoma"/>
-          <w:b/>
-          <w:bCs/>
-          <w:sz w:val="22"/>
-        </w:rPr>
-        <w:t xml:space="preserve"> I/O</w:t>
-      </w:r>
-      <w:r>
-        <w:rPr>
-          <w:rFonts w:ascii="Tahoma" w:hAnsi="Tahoma" w:cs="Tahoma"/>
-          <w:b/>
-          <w:bCs/>
-          <w:sz w:val="22"/>
-        </w:rPr>
-        <w:t>、</w:t>
-      </w:r>
-      <w:r>
-        <w:rPr>
-          <w:rFonts w:ascii="Tahoma" w:hAnsi="Tahoma" w:cs="Tahoma"/>
-          <w:b/>
-          <w:bCs/>
-          <w:sz w:val="22"/>
-        </w:rPr>
-        <w:t xml:space="preserve">Linux </w:t>
-      </w:r>
-      <w:r>
-        <w:rPr>
-          <w:rFonts w:ascii="Tahoma" w:hAnsi="Tahoma" w:cs="Tahoma"/>
-          <w:b/>
-          <w:bCs/>
-          <w:sz w:val="22"/>
-        </w:rPr>
-        <w:t>作业调度、数据库索引、</w:t>
-      </w:r>
-      <w:r>
-        <w:rPr>
-          <w:rFonts w:ascii="Tahoma" w:hAnsi="Tahoma" w:cs="Tahoma"/>
-          <w:b/>
-          <w:bCs/>
-          <w:sz w:val="22"/>
-        </w:rPr>
-        <w:t xml:space="preserve">Redis </w:t>
-      </w:r>
-      <w:r>
-        <w:rPr>
-          <w:rFonts w:ascii="Tahoma" w:hAnsi="Tahoma" w:cs="Tahoma"/>
-          <w:b/>
-          <w:bCs/>
-          <w:sz w:val="22"/>
-        </w:rPr>
-        <w:t>缓存、</w:t>
-      </w:r>
-      <w:r>
-        <w:rPr>
-          <w:rFonts w:ascii="Tahoma" w:hAnsi="Tahoma" w:cs="Tahoma"/>
-          <w:b/>
-          <w:bCs/>
-          <w:sz w:val="22"/>
-        </w:rPr>
-        <w:t>HTTP API</w:t>
-      </w:r>
-      <w:r>
-        <w:rPr>
-          <w:rFonts w:ascii="Tahoma" w:hAnsi="Tahoma" w:cs="Tahoma"/>
-          <w:b/>
-          <w:bCs/>
-          <w:sz w:val="22"/>
-        </w:rPr>
-        <w:t>、异步任务、日志追踪、</w:t>
-      </w:r>
-      <w:r>
-        <w:rPr>
-          <w:rFonts w:ascii="Tahoma" w:hAnsi="Tahoma" w:cs="Tahoma"/>
-          <w:b/>
-          <w:bCs/>
-          <w:sz w:val="22"/>
-        </w:rPr>
-        <w:t>RAG</w:t>
-      </w:r>
-      <w:r>
-        <w:rPr>
-          <w:rFonts w:ascii="Tahoma" w:hAnsi="Tahoma" w:cs="Tahoma"/>
-          <w:b/>
-          <w:bCs/>
-          <w:sz w:val="22"/>
-        </w:rPr>
-        <w:t>、</w:t>
-      </w:r>
-      <w:r>
-        <w:rPr>
-          <w:rFonts w:ascii="Tahoma" w:hAnsi="Tahoma" w:cs="Tahoma"/>
-          <w:b/>
-          <w:bCs/>
-          <w:sz w:val="22"/>
-        </w:rPr>
-        <w:t xml:space="preserve">Agent </w:t>
-      </w:r>
-      <w:r>
-        <w:rPr>
-          <w:rFonts w:ascii="Tahoma" w:hAnsi="Tahoma" w:cs="Tahoma"/>
-          <w:b/>
-          <w:bCs/>
-          <w:sz w:val="22"/>
-        </w:rPr>
-        <w:t>工具调用、系统设计、性能瓶颈分析。</w:t>
+          <w:sz w:val="24"/>
+          <w:szCs w:val="24"/>
+        </w:rPr>
+      </w:pPr>
+      <w:r>
+        <w:rPr>
+          <w:rFonts w:ascii="Tahoma" w:hAnsi="Tahoma" w:cs="Tahoma"/>
+          <w:b/>
+          <w:bCs/>
+          <w:sz w:val="24"/>
+          <w:szCs w:val="24"/>
+        </w:rPr>
+        <w:t>论文发表</w:t>
       </w:r>
     </w:p>
     <w:p>
       <w:pPr>
         <w:rPr>
-          <w:rFonts w:ascii="Tahoma" w:hAnsi="Tahoma" w:cs="Tahoma"/>
-          <w:szCs w:val="21"/>
-        </w:rPr>
-      </w:pPr>
-      <w:r>
-        <w:rPr>
-          <w:rFonts w:ascii="Tahoma" w:hAnsi="Tahoma" w:cs="Tahoma"/>
-          <w:szCs w:val="21"/>
-        </w:rPr>
-        <w:pict w14:anchorId="4EB0BEE6">
-          <v:rect id="_x0000_i1030" style="width:0;height:1.5pt" o:hralign="center" o:hrstd="t" o:hr="t" fillcolor="#a0a0a0" stroked="f"/>
-        </w:pict>
-      </w:r>
-    </w:p>
-    <w:p>
-      <w:pPr>
-        <w:rPr>
-          <w:rFonts w:ascii="Tahoma" w:hAnsi="Tahoma" w:cs="Tahoma"/>
-          <w:b/>
-          <w:bCs/>
-          <w:sz w:val="24"/>
-          <w:szCs w:val="24"/>
-        </w:rPr>
-      </w:pPr>
-      <w:r>
-        <w:rPr>
-          <w:rFonts w:ascii="Tahoma" w:hAnsi="Tahoma" w:cs="Tahoma"/>
-          <w:b/>
-          <w:bCs/>
-          <w:sz w:val="24"/>
-          <w:szCs w:val="24"/>
-        </w:rPr>
-        <w:t>论文发表</w:t>
-      </w:r>
-    </w:p>
-    <w:p>
-      <w:pPr>
-        <w:rPr>
-          <w:rFonts w:ascii="Tahoma" w:hAnsi="Tahoma" w:cs="Tahoma"/>
+          <w:rFonts w:ascii="Tahoma" w:hAnsi="Tahoma" w:cs="Tahoma" w:hint="eastAsia"/>
           <w:szCs w:val="21"/>
         </w:rPr>
       </w:pPr>
@@ -4367,21 +4736,7 @@
         <w:br/>
         <w:t>International Conference on Engineering Management, Information Technology and Intelligence, EMITI 2024.</w:t>
       </w:r>
-      <w:r>
-        <w:rPr>
-          <w:rFonts w:ascii="Tahoma" w:hAnsi="Tahoma" w:cs="Tahoma"/>
-          <w:szCs w:val="21"/>
-        </w:rPr>
-        <w:br/>
-      </w:r>
-    </w:p>
-    <w:bookmarkEnd w:id="1"/>
-    <w:p>
-      <w:pPr>
-        <w:rPr>
-          <w:szCs w:val="21"/>
-        </w:rPr>
-      </w:pPr>
+      <w:bookmarkEnd w:id="1"/>
     </w:p>
     <w:sectPr>
       <w:pgSz w:w="11906" w:h="16838"/>
@@ -7175,6 +7530,7 @@
   <w:style w:type="paragraph" w:default="1" w:styleId="a">
     <w:name w:val="Normal"/>
     <w:qFormat/>
+    <w:rsid w:val="00802BA6"/>
     <w:pPr>
       <w:widowControl w:val="0"/>
       <w:jc w:val="both"/>
@@ -7797,6 +8153,19 @@
       <w:shd w:val="clear" w:color="auto" w:fill="E1DFDD"/>
     </w:rPr>
   </w:style>
+  <w:style w:type="paragraph" w:customStyle="1" w:styleId="CVSection">
+    <w:name w:val="CVSection"/>
+    <w:rsid w:val="00802BA6"/>
+    <w:pPr>
+      <w:spacing w:before="40" w:after="40" w:line="252" w:lineRule="auto"/>
+    </w:pPr>
+    <w:rPr>
+      <w:rFonts w:ascii="Noto Sans CJK SC" w:eastAsia="Noto Sans CJK SC" w:hAnsi="Noto Sans CJK SC"/>
+      <w:b/>
+      <w:kern w:val="0"/>
+      <w:lang w:eastAsia="en-US"/>
+    </w:rPr>
+  </w:style>
 </w:styles>
 </file>
 

</xml_diff>